<commit_message>
Finished main body of the report
</commit_message>
<xml_diff>
--- a/Report/Submission/Report.docx
+++ b/Report/Submission/Report.docx
@@ -6,22 +6,6 @@
       <w:pPr>
         <w:spacing w:line="240" w:lineRule="auto"/>
         <w:rPr>
-          <w:sz w:val="22"/>
-          <w:szCs w:val="22"/>
-        </w:rPr>
-      </w:pPr>
-      <w:r>
-        <w:rPr>
-          <w:sz w:val="22"/>
-          <w:szCs w:val="22"/>
-        </w:rPr>
-        <w:t>Title</w:t>
-      </w:r>
-    </w:p>
-    <w:p>
-      <w:pPr>
-        <w:spacing w:line="240" w:lineRule="auto"/>
-        <w:rPr>
           <w:b/>
           <w:bCs/>
           <w:sz w:val="22"/>
@@ -393,6 +377,16 @@
         </w:rPr>
         <w:t>The report and video tasks are also included in the WBS as final deliverables.</w:t>
       </w:r>
+    </w:p>
+    <w:p>
+      <w:pPr>
+        <w:spacing w:line="240" w:lineRule="auto"/>
+        <w:rPr>
+          <w:sz w:val="22"/>
+          <w:szCs w:val="22"/>
+          <w:lang w:val="en-US"/>
+        </w:rPr>
+      </w:pPr>
     </w:p>
     <w:p>
       <w:pPr>
@@ -446,36 +440,38 @@
     <w:p>
       <w:pPr>
         <w:pStyle w:val="Caption"/>
-        <w:rPr>
-          <w:sz w:val="22"/>
-          <w:szCs w:val="22"/>
+      </w:pPr>
+      <w:r>
+        <w:t xml:space="preserve">Figure </w:t>
+      </w:r>
+      <w:r>
+        <w:fldChar w:fldCharType="begin"/>
+      </w:r>
+      <w:r>
+        <w:instrText xml:space="preserve"> SEQ Figure \* ARABIC </w:instrText>
+      </w:r>
+      <w:r>
+        <w:fldChar w:fldCharType="separate"/>
+      </w:r>
+      <w:r>
+        <w:rPr>
+          <w:noProof/>
+        </w:rPr>
+        <w:t>1</w:t>
+      </w:r>
+      <w:r>
+        <w:fldChar w:fldCharType="end"/>
+      </w:r>
+      <w:r>
+        <w:t>: Work Breakdown Structure</w:t>
+      </w:r>
+    </w:p>
+    <w:p>
+      <w:pPr>
+        <w:rPr>
           <w:lang w:val="en-US"/>
         </w:rPr>
       </w:pPr>
-      <w:r>
-        <w:t xml:space="preserve">Figure </w:t>
-      </w:r>
-      <w:r>
-        <w:fldChar w:fldCharType="begin"/>
-      </w:r>
-      <w:r>
-        <w:instrText xml:space="preserve"> SEQ Figure \* ARABIC </w:instrText>
-      </w:r>
-      <w:r>
-        <w:fldChar w:fldCharType="separate"/>
-      </w:r>
-      <w:r>
-        <w:rPr>
-          <w:noProof/>
-        </w:rPr>
-        <w:t>1</w:t>
-      </w:r>
-      <w:r>
-        <w:fldChar w:fldCharType="end"/>
-      </w:r>
-      <w:r>
-        <w:t>: Work Breakdown Structure</w:t>
-      </w:r>
     </w:p>
     <w:p>
       <w:pPr>
@@ -520,6 +516,24 @@
         </w:rPr>
         <w:t xml:space="preserve">the actual workflow and therefore some other items, like code review and team management, are also added, resulting in the upcoming list of member contributions. </w:t>
       </w:r>
+    </w:p>
+    <w:p>
+      <w:pPr>
+        <w:spacing w:line="240" w:lineRule="auto"/>
+        <w:rPr>
+          <w:sz w:val="22"/>
+          <w:szCs w:val="22"/>
+        </w:rPr>
+      </w:pPr>
+    </w:p>
+    <w:p>
+      <w:pPr>
+        <w:spacing w:line="240" w:lineRule="auto"/>
+        <w:rPr>
+          <w:sz w:val="22"/>
+          <w:szCs w:val="22"/>
+        </w:rPr>
+      </w:pPr>
     </w:p>
     <w:p>
       <w:pPr>
@@ -558,6 +572,7 @@
           <w:sz w:val="22"/>
           <w:szCs w:val="22"/>
         </w:rPr>
+        <w:lastRenderedPageBreak/>
         <w:t>Lead</w:t>
       </w:r>
     </w:p>
@@ -658,7 +673,6 @@
           <w:sz w:val="22"/>
           <w:szCs w:val="22"/>
         </w:rPr>
-        <w:lastRenderedPageBreak/>
         <w:t>Simulation and debugging</w:t>
       </w:r>
     </w:p>
@@ -1284,6 +1298,76 @@
     </w:p>
     <w:p>
       <w:pPr>
+        <w:pStyle w:val="ListParagraph"/>
+        <w:ind w:left="1701"/>
+        <w:rPr>
+          <w:sz w:val="22"/>
+          <w:szCs w:val="22"/>
+        </w:rPr>
+      </w:pPr>
+    </w:p>
+    <w:p>
+      <w:pPr>
+        <w:pStyle w:val="ListParagraph"/>
+        <w:ind w:left="1701"/>
+        <w:rPr>
+          <w:sz w:val="22"/>
+          <w:szCs w:val="22"/>
+        </w:rPr>
+      </w:pPr>
+    </w:p>
+    <w:p>
+      <w:pPr>
+        <w:pStyle w:val="ListParagraph"/>
+        <w:ind w:left="1701"/>
+        <w:rPr>
+          <w:sz w:val="22"/>
+          <w:szCs w:val="22"/>
+        </w:rPr>
+      </w:pPr>
+    </w:p>
+    <w:p>
+      <w:pPr>
+        <w:pStyle w:val="ListParagraph"/>
+        <w:ind w:left="1701"/>
+        <w:rPr>
+          <w:sz w:val="22"/>
+          <w:szCs w:val="22"/>
+        </w:rPr>
+      </w:pPr>
+    </w:p>
+    <w:p>
+      <w:pPr>
+        <w:pStyle w:val="ListParagraph"/>
+        <w:ind w:left="1701"/>
+        <w:rPr>
+          <w:sz w:val="22"/>
+          <w:szCs w:val="22"/>
+        </w:rPr>
+      </w:pPr>
+    </w:p>
+    <w:p>
+      <w:pPr>
+        <w:pStyle w:val="ListParagraph"/>
+        <w:ind w:left="1701"/>
+        <w:rPr>
+          <w:sz w:val="22"/>
+          <w:szCs w:val="22"/>
+        </w:rPr>
+      </w:pPr>
+    </w:p>
+    <w:p>
+      <w:pPr>
+        <w:pStyle w:val="ListParagraph"/>
+        <w:ind w:left="1701"/>
+        <w:rPr>
+          <w:sz w:val="22"/>
+          <w:szCs w:val="22"/>
+        </w:rPr>
+      </w:pPr>
+    </w:p>
+    <w:p>
+      <w:pPr>
         <w:spacing w:line="240" w:lineRule="auto"/>
         <w:rPr>
           <w:b/>
@@ -1315,6 +1399,7 @@
           <w:sz w:val="22"/>
           <w:szCs w:val="22"/>
         </w:rPr>
+        <w:lastRenderedPageBreak/>
         <w:t xml:space="preserve">A timeline is assigned to the stage deliverables indicated above, forming a Gantt Chart shown in </w:t>
       </w:r>
       <w:r>
@@ -1368,11 +1453,10 @@
           <w:sz w:val="22"/>
           <w:szCs w:val="22"/>
         </w:rPr>
-        <w:lastRenderedPageBreak/>
         <w:drawing>
-          <wp:inline distT="0" distB="0" distL="0" distR="0" wp14:anchorId="0C37D8AC" wp14:editId="27B5B227">
+          <wp:inline distT="0" distB="0" distL="0" distR="0" wp14:anchorId="0C37D8AC" wp14:editId="1CF49225">
             <wp:extent cx="5731510" cy="3912235"/>
-            <wp:effectExtent l="0" t="0" r="0" b="0"/>
+            <wp:effectExtent l="0" t="0" r="0" b="1270"/>
             <wp:docPr id="136489788" name="Picture 16" descr="A screenshot of a projector&#10;&#10;Description automatically generated"/>
             <wp:cNvGraphicFramePr>
               <a:graphicFrameLocks xmlns:a="http://schemas.openxmlformats.org/drawingml/2006/main" noChangeAspect="1"/>
@@ -1559,7 +1643,6 @@
         </w:rPr>
         <w:t>`</w:t>
       </w:r>
-      <w:proofErr w:type="spellStart"/>
       <w:r>
         <w:rPr>
           <w:sz w:val="22"/>
@@ -1567,7 +1650,6 @@
         </w:rPr>
         <w:t>ctrlIn</w:t>
       </w:r>
-      <w:proofErr w:type="spellEnd"/>
       <w:r>
         <w:rPr>
           <w:sz w:val="22"/>
@@ -1668,7 +1750,6 @@
         </w:rPr>
         <w:t>`</w:t>
       </w:r>
-      <w:proofErr w:type="spellStart"/>
       <w:r>
         <w:rPr>
           <w:sz w:val="22"/>
@@ -1676,7 +1757,6 @@
         </w:rPr>
         <w:t>numWords</w:t>
       </w:r>
-      <w:proofErr w:type="spellEnd"/>
       <w:r>
         <w:rPr>
           <w:sz w:val="22"/>
@@ -1726,7 +1806,6 @@
         </w:rPr>
         <w:t>`</w:t>
       </w:r>
-      <w:proofErr w:type="spellStart"/>
       <w:r>
         <w:rPr>
           <w:sz w:val="22"/>
@@ -1734,7 +1813,6 @@
         </w:rPr>
         <w:t>maxIndex</w:t>
       </w:r>
-      <w:proofErr w:type="spellEnd"/>
       <w:r>
         <w:rPr>
           <w:sz w:val="22"/>
@@ -1756,7 +1834,6 @@
         </w:rPr>
         <w:t>`</w:t>
       </w:r>
-      <w:proofErr w:type="spellStart"/>
       <w:r>
         <w:rPr>
           <w:sz w:val="22"/>
@@ -1764,7 +1841,6 @@
         </w:rPr>
         <w:t>dataResults</w:t>
       </w:r>
-      <w:proofErr w:type="spellEnd"/>
       <w:r>
         <w:rPr>
           <w:sz w:val="22"/>
@@ -1848,482 +1924,6 @@
           <w:szCs w:val="22"/>
         </w:rPr>
         <w:t xml:space="preserve"> signals represent if this result above is prepared or not.</w:t>
-      </w:r>
-    </w:p>
-    <w:p>
-      <w:pPr>
-        <w:spacing w:line="240" w:lineRule="auto"/>
-        <w:rPr>
-          <w:sz w:val="22"/>
-          <w:szCs w:val="22"/>
-        </w:rPr>
-      </w:pPr>
-      <w:r>
-        <w:rPr>
-          <w:sz w:val="22"/>
-          <w:szCs w:val="22"/>
-        </w:rPr>
-        <w:t>To achieve the desired function,</w:t>
-      </w:r>
-      <w:r>
-        <w:rPr>
-          <w:sz w:val="22"/>
-          <w:szCs w:val="22"/>
-        </w:rPr>
-        <w:t xml:space="preserve"> a total of 151 registers as flip flop are applied. Beyond the state registers, a </w:t>
-      </w:r>
-      <w:r>
-        <w:rPr>
-          <w:sz w:val="22"/>
-          <w:szCs w:val="22"/>
-        </w:rPr>
-        <w:t>‘</w:t>
-      </w:r>
-      <w:r>
-        <w:rPr>
-          <w:sz w:val="22"/>
-          <w:szCs w:val="22"/>
-        </w:rPr>
-        <w:t>finished</w:t>
-      </w:r>
-      <w:r>
-        <w:rPr>
-          <w:sz w:val="22"/>
-          <w:szCs w:val="22"/>
-        </w:rPr>
-        <w:t>’</w:t>
-      </w:r>
-      <w:r>
-        <w:rPr>
-          <w:sz w:val="22"/>
-          <w:szCs w:val="22"/>
-        </w:rPr>
-        <w:t xml:space="preserve"> </w:t>
-      </w:r>
-      <w:r>
-        <w:rPr>
-          <w:sz w:val="22"/>
-          <w:szCs w:val="22"/>
-        </w:rPr>
-        <w:t xml:space="preserve">register with the default value of 1, and a ‘counter’ </w:t>
-      </w:r>
-      <w:r>
-        <w:rPr>
-          <w:sz w:val="22"/>
-          <w:szCs w:val="22"/>
-        </w:rPr>
-        <w:t xml:space="preserve">register </w:t>
-      </w:r>
-      <w:r>
-        <w:rPr>
-          <w:sz w:val="22"/>
-          <w:szCs w:val="22"/>
-        </w:rPr>
-        <w:t>that augments after a new data is consumed, are</w:t>
-      </w:r>
-      <w:r>
-        <w:rPr>
-          <w:sz w:val="22"/>
-          <w:szCs w:val="22"/>
-        </w:rPr>
-        <w:t xml:space="preserve"> used to</w:t>
-      </w:r>
-      <w:r>
-        <w:rPr>
-          <w:sz w:val="22"/>
-          <w:szCs w:val="22"/>
-        </w:rPr>
-        <w:t xml:space="preserve"> control the iteration</w:t>
-      </w:r>
-      <w:r>
-        <w:rPr>
-          <w:sz w:val="22"/>
-          <w:szCs w:val="22"/>
-        </w:rPr>
-        <w:t xml:space="preserve">, and the default value is 1. </w:t>
-      </w:r>
-      <w:r>
-        <w:rPr>
-          <w:sz w:val="22"/>
-          <w:szCs w:val="22"/>
-        </w:rPr>
-        <w:t>To prevent potential data loss, the 3-digit BCD ‘</w:t>
-      </w:r>
-      <w:proofErr w:type="spellStart"/>
-      <w:r>
-        <w:rPr>
-          <w:sz w:val="22"/>
-          <w:szCs w:val="22"/>
-        </w:rPr>
-        <w:t>numWords</w:t>
-      </w:r>
-      <w:proofErr w:type="spellEnd"/>
-      <w:r>
-        <w:rPr>
-          <w:sz w:val="22"/>
-          <w:szCs w:val="22"/>
-        </w:rPr>
-        <w:t>’ is sliced, then concatenated and the result is stored in a separated ‘NNN’ register.</w:t>
-      </w:r>
-    </w:p>
-    <w:p>
-      <w:pPr>
-        <w:spacing w:line="240" w:lineRule="auto"/>
-        <w:rPr>
-          <w:sz w:val="22"/>
-          <w:szCs w:val="22"/>
-        </w:rPr>
-      </w:pPr>
-      <w:r>
-        <w:rPr>
-          <w:sz w:val="22"/>
-          <w:szCs w:val="22"/>
-        </w:rPr>
-        <w:t>Additionally, the</w:t>
-      </w:r>
-      <w:r>
-        <w:rPr>
-          <w:sz w:val="22"/>
-          <w:szCs w:val="22"/>
-        </w:rPr>
-        <w:t xml:space="preserve"> result</w:t>
-      </w:r>
-      <w:r>
-        <w:rPr>
-          <w:sz w:val="22"/>
-          <w:szCs w:val="22"/>
-        </w:rPr>
-        <w:t xml:space="preserve"> information</w:t>
-      </w:r>
-      <w:r>
-        <w:rPr>
-          <w:sz w:val="22"/>
-          <w:szCs w:val="22"/>
-        </w:rPr>
-        <w:t xml:space="preserve"> mentioned above is registered as well. To </w:t>
-      </w:r>
-      <w:r>
-        <w:rPr>
-          <w:sz w:val="22"/>
-          <w:szCs w:val="22"/>
-        </w:rPr>
-        <w:t>monitor</w:t>
-      </w:r>
-      <w:r>
-        <w:rPr>
-          <w:sz w:val="22"/>
-          <w:szCs w:val="22"/>
-        </w:rPr>
-        <w:t xml:space="preserve"> </w:t>
-      </w:r>
-      <w:r>
-        <w:rPr>
-          <w:sz w:val="22"/>
-          <w:szCs w:val="22"/>
-        </w:rPr>
-        <w:t xml:space="preserve">the flip of </w:t>
-      </w:r>
-      <w:r>
-        <w:rPr>
-          <w:sz w:val="22"/>
-          <w:szCs w:val="22"/>
-        </w:rPr>
-        <w:t xml:space="preserve">the </w:t>
-      </w:r>
-      <w:r>
-        <w:rPr>
-          <w:sz w:val="22"/>
-          <w:szCs w:val="22"/>
-        </w:rPr>
-        <w:t>`</w:t>
-      </w:r>
-      <w:r>
-        <w:rPr>
-          <w:sz w:val="22"/>
-          <w:szCs w:val="22"/>
-        </w:rPr>
-        <w:t>ctrlIn</w:t>
-      </w:r>
-      <w:r>
-        <w:rPr>
-          <w:sz w:val="22"/>
-          <w:szCs w:val="22"/>
-        </w:rPr>
-        <w:t>`</w:t>
-      </w:r>
-      <w:r>
-        <w:rPr>
-          <w:sz w:val="22"/>
-          <w:szCs w:val="22"/>
-        </w:rPr>
-        <w:t xml:space="preserve"> signal, its delayed </w:t>
-      </w:r>
-      <w:r>
-        <w:rPr>
-          <w:sz w:val="22"/>
-          <w:szCs w:val="22"/>
-        </w:rPr>
-        <w:t xml:space="preserve">version </w:t>
-      </w:r>
-      <w:r>
-        <w:rPr>
-          <w:sz w:val="22"/>
-          <w:szCs w:val="22"/>
-        </w:rPr>
-        <w:t xml:space="preserve">is recorded to compare with the current one. </w:t>
-      </w:r>
-    </w:p>
-    <w:p>
-      <w:pPr>
-        <w:spacing w:line="240" w:lineRule="auto"/>
-        <w:rPr>
-          <w:sz w:val="22"/>
-          <w:szCs w:val="22"/>
-        </w:rPr>
-      </w:pPr>
-      <w:r>
-        <w:rPr>
-          <w:sz w:val="22"/>
-          <w:szCs w:val="22"/>
-        </w:rPr>
-        <w:lastRenderedPageBreak/>
-        <w:t>To remember the preceding and following three numbers</w:t>
-      </w:r>
-      <w:r>
-        <w:rPr>
-          <w:sz w:val="22"/>
-          <w:szCs w:val="22"/>
-        </w:rPr>
-        <w:t xml:space="preserve">, a </w:t>
-      </w:r>
-      <w:r>
-        <w:rPr>
-          <w:sz w:val="22"/>
-          <w:szCs w:val="22"/>
-        </w:rPr>
-        <w:t xml:space="preserve">shifting buffer consisting of seven 8-bit elements is declared. It is left shifted by one position when a new byte is received and appended subsequently. </w:t>
-      </w:r>
-      <w:r>
-        <w:rPr>
-          <w:sz w:val="22"/>
-          <w:szCs w:val="22"/>
-        </w:rPr>
-        <w:t xml:space="preserve">The currently stored max value is compared to the centre value of buffer, namely, </w:t>
-      </w:r>
-      <w:proofErr w:type="gramStart"/>
-      <w:r>
-        <w:rPr>
-          <w:sz w:val="22"/>
-          <w:szCs w:val="22"/>
-        </w:rPr>
-        <w:t>buffer[</w:t>
-      </w:r>
-      <w:proofErr w:type="gramEnd"/>
-      <w:r>
-        <w:rPr>
-          <w:sz w:val="22"/>
-          <w:szCs w:val="22"/>
-        </w:rPr>
-        <w:t>3], and updated</w:t>
-      </w:r>
-      <w:r>
-        <w:rPr>
-          <w:sz w:val="22"/>
-          <w:szCs w:val="22"/>
-        </w:rPr>
-        <w:t xml:space="preserve"> </w:t>
-      </w:r>
-      <w:r>
-        <w:rPr>
-          <w:sz w:val="22"/>
-          <w:szCs w:val="22"/>
-        </w:rPr>
-        <w:t>if</w:t>
-      </w:r>
-      <w:r>
-        <w:rPr>
-          <w:sz w:val="22"/>
-          <w:szCs w:val="22"/>
-        </w:rPr>
-        <w:t xml:space="preserve"> the lat</w:t>
-      </w:r>
-      <w:r>
-        <w:rPr>
-          <w:sz w:val="22"/>
-          <w:szCs w:val="22"/>
-        </w:rPr>
-        <w:t>t</w:t>
-      </w:r>
-      <w:r>
-        <w:rPr>
-          <w:sz w:val="22"/>
-          <w:szCs w:val="22"/>
-        </w:rPr>
-        <w:t xml:space="preserve">er one is </w:t>
-      </w:r>
-      <w:r>
-        <w:rPr>
-          <w:sz w:val="22"/>
-          <w:szCs w:val="22"/>
-        </w:rPr>
-        <w:t>greater</w:t>
-      </w:r>
-      <w:r>
-        <w:rPr>
-          <w:sz w:val="22"/>
-          <w:szCs w:val="22"/>
-        </w:rPr>
-        <w:t>.</w:t>
-      </w:r>
-      <w:r>
-        <w:rPr>
-          <w:sz w:val="22"/>
-          <w:szCs w:val="22"/>
-        </w:rPr>
-        <w:t xml:space="preserve"> </w:t>
-      </w:r>
-      <w:r>
-        <w:rPr>
-          <w:sz w:val="22"/>
-          <w:szCs w:val="22"/>
-        </w:rPr>
-        <w:t xml:space="preserve">Furthermore, </w:t>
-      </w:r>
-      <w:r>
-        <w:rPr>
-          <w:sz w:val="22"/>
-          <w:szCs w:val="22"/>
-        </w:rPr>
-        <w:t xml:space="preserve">the output </w:t>
-      </w:r>
-      <w:r>
-        <w:rPr>
-          <w:sz w:val="22"/>
-          <w:szCs w:val="22"/>
-        </w:rPr>
-        <w:t>‘</w:t>
-      </w:r>
-      <w:r>
-        <w:rPr>
-          <w:sz w:val="22"/>
-          <w:szCs w:val="22"/>
-        </w:rPr>
-        <w:t>byte</w:t>
-      </w:r>
-      <w:r>
-        <w:rPr>
-          <w:sz w:val="22"/>
-          <w:szCs w:val="22"/>
-        </w:rPr>
-        <w:t>’</w:t>
-      </w:r>
-      <w:r>
-        <w:rPr>
-          <w:sz w:val="22"/>
-          <w:szCs w:val="22"/>
-        </w:rPr>
-        <w:t xml:space="preserve"> points to the last entry of this shifting buffer.</w:t>
-      </w:r>
-    </w:p>
-    <w:p>
-      <w:pPr>
-        <w:spacing w:line="240" w:lineRule="auto"/>
-        <w:rPr>
-          <w:sz w:val="22"/>
-          <w:szCs w:val="22"/>
-        </w:rPr>
-      </w:pPr>
-      <w:r>
-        <w:rPr>
-          <w:sz w:val="22"/>
-          <w:szCs w:val="22"/>
-        </w:rPr>
-        <w:t xml:space="preserve">Therefore, </w:t>
-      </w:r>
-      <w:r>
-        <w:rPr>
-          <w:sz w:val="22"/>
-          <w:szCs w:val="22"/>
-        </w:rPr>
-        <w:t xml:space="preserve">in the first three retrieving cycles, the buffer is being filled but no comparison is performed. Subsequently, NNN–3 data are retrieved and appended in the buffer. Finally, a dummy value, </w:t>
-      </w:r>
-      <w:r>
-        <w:rPr>
-          <w:color w:val="FF0000"/>
-          <w:sz w:val="22"/>
-          <w:szCs w:val="22"/>
-        </w:rPr>
-        <w:t>0x8</w:t>
-      </w:r>
-      <w:r>
-        <w:rPr>
-          <w:sz w:val="22"/>
-          <w:szCs w:val="22"/>
-        </w:rPr>
-        <w:t xml:space="preserve">, </w:t>
-      </w:r>
-      <w:r>
-        <w:rPr>
-          <w:sz w:val="22"/>
-          <w:szCs w:val="22"/>
-        </w:rPr>
-        <w:t xml:space="preserve">is inserted </w:t>
-      </w:r>
-      <w:r>
-        <w:rPr>
-          <w:sz w:val="22"/>
-          <w:szCs w:val="22"/>
-        </w:rPr>
-        <w:t>for three times</w:t>
-      </w:r>
-      <w:r>
-        <w:rPr>
-          <w:sz w:val="22"/>
-          <w:szCs w:val="22"/>
-        </w:rPr>
-        <w:t xml:space="preserve"> to ensure the last generated number is shifted to the centre position.</w:t>
-      </w:r>
-      <w:r>
-        <w:rPr>
-          <w:sz w:val="22"/>
-          <w:szCs w:val="22"/>
-        </w:rPr>
-        <w:t xml:space="preserve"> </w:t>
-      </w:r>
-      <w:r>
-        <w:rPr>
-          <w:sz w:val="22"/>
-          <w:szCs w:val="22"/>
-        </w:rPr>
-        <w:t xml:space="preserve">The output </w:t>
-      </w:r>
-      <w:r>
-        <w:rPr>
-          <w:sz w:val="22"/>
-          <w:szCs w:val="22"/>
-        </w:rPr>
-        <w:t>`</w:t>
-      </w:r>
-      <w:r>
-        <w:rPr>
-          <w:sz w:val="22"/>
-          <w:szCs w:val="22"/>
-        </w:rPr>
-        <w:t>byte</w:t>
-      </w:r>
-      <w:r>
-        <w:rPr>
-          <w:sz w:val="22"/>
-          <w:szCs w:val="22"/>
-        </w:rPr>
-        <w:t>`</w:t>
-      </w:r>
-      <w:r>
-        <w:rPr>
-          <w:sz w:val="22"/>
-          <w:szCs w:val="22"/>
-        </w:rPr>
-        <w:t xml:space="preserve"> points to the last entry of this shifting buffer.</w:t>
       </w:r>
     </w:p>
     <w:p>
@@ -2337,6 +1937,555 @@
           <w:sz w:val="22"/>
           <w:szCs w:val="22"/>
         </w:rPr>
+        <w:lastRenderedPageBreak/>
+        <w:drawing>
+          <wp:inline distT="0" distB="0" distL="0" distR="0" wp14:anchorId="2080AF50" wp14:editId="78DF91FF">
+            <wp:extent cx="5731510" cy="2901950"/>
+            <wp:effectExtent l="0" t="0" r="0" b="6350"/>
+            <wp:docPr id="1090812253" name="Picture 17" descr="A diagram of a system&#10;&#10;Description automatically generated"/>
+            <wp:cNvGraphicFramePr>
+              <a:graphicFrameLocks xmlns:a="http://schemas.openxmlformats.org/drawingml/2006/main" noChangeAspect="1"/>
+            </wp:cNvGraphicFramePr>
+            <a:graphic xmlns:a="http://schemas.openxmlformats.org/drawingml/2006/main">
+              <a:graphicData uri="http://schemas.openxmlformats.org/drawingml/2006/picture">
+                <pic:pic xmlns:pic="http://schemas.openxmlformats.org/drawingml/2006/picture">
+                  <pic:nvPicPr>
+                    <pic:cNvPr id="1090812253" name="Picture 17" descr="A diagram of a system&#10;&#10;Description automatically generated"/>
+                    <pic:cNvPicPr/>
+                  </pic:nvPicPr>
+                  <pic:blipFill>
+                    <a:blip r:embed="rId8"/>
+                    <a:stretch>
+                      <a:fillRect/>
+                    </a:stretch>
+                  </pic:blipFill>
+                  <pic:spPr>
+                    <a:xfrm>
+                      <a:off x="0" y="0"/>
+                      <a:ext cx="5731510" cy="2901950"/>
+                    </a:xfrm>
+                    <a:prstGeom prst="rect">
+                      <a:avLst/>
+                    </a:prstGeom>
+                  </pic:spPr>
+                </pic:pic>
+              </a:graphicData>
+            </a:graphic>
+          </wp:inline>
+        </w:drawing>
+      </w:r>
+    </w:p>
+    <w:p>
+      <w:pPr>
+        <w:pStyle w:val="Caption"/>
+        <w:rPr>
+          <w:sz w:val="22"/>
+          <w:szCs w:val="22"/>
+        </w:rPr>
+      </w:pPr>
+      <w:r>
+        <w:t xml:space="preserve">Figure </w:t>
+      </w:r>
+      <w:r>
+        <w:fldChar w:fldCharType="begin"/>
+      </w:r>
+      <w:r>
+        <w:instrText xml:space="preserve"> SEQ Figure \* ARABIC </w:instrText>
+      </w:r>
+      <w:r>
+        <w:fldChar w:fldCharType="separate"/>
+      </w:r>
+      <w:r>
+        <w:rPr>
+          <w:noProof/>
+        </w:rPr>
+        <w:t>3</w:t>
+      </w:r>
+      <w:r>
+        <w:fldChar w:fldCharType="end"/>
+      </w:r>
+      <w:r>
+        <w:t>: Block-level diagram of data processor</w:t>
+      </w:r>
+    </w:p>
+    <w:p>
+      <w:pPr>
+        <w:spacing w:line="240" w:lineRule="auto"/>
+        <w:rPr>
+          <w:sz w:val="22"/>
+          <w:szCs w:val="22"/>
+        </w:rPr>
+      </w:pPr>
+    </w:p>
+    <w:p>
+      <w:pPr>
+        <w:spacing w:line="240" w:lineRule="auto"/>
+        <w:rPr>
+          <w:sz w:val="22"/>
+          <w:szCs w:val="22"/>
+        </w:rPr>
+      </w:pPr>
+      <w:r>
+        <w:rPr>
+          <w:sz w:val="22"/>
+          <w:szCs w:val="22"/>
+        </w:rPr>
+        <w:t>To achieve the desired function,</w:t>
+      </w:r>
+      <w:r>
+        <w:rPr>
+          <w:sz w:val="22"/>
+          <w:szCs w:val="22"/>
+        </w:rPr>
+        <w:t xml:space="preserve"> a total of 151 registers as flip flop are applied. Beyond the state registers, a </w:t>
+      </w:r>
+      <w:r>
+        <w:rPr>
+          <w:sz w:val="22"/>
+          <w:szCs w:val="22"/>
+        </w:rPr>
+        <w:t>‘</w:t>
+      </w:r>
+      <w:r>
+        <w:rPr>
+          <w:sz w:val="22"/>
+          <w:szCs w:val="22"/>
+        </w:rPr>
+        <w:t>finished</w:t>
+      </w:r>
+      <w:r>
+        <w:rPr>
+          <w:sz w:val="22"/>
+          <w:szCs w:val="22"/>
+        </w:rPr>
+        <w:t>’</w:t>
+      </w:r>
+      <w:r>
+        <w:rPr>
+          <w:sz w:val="22"/>
+          <w:szCs w:val="22"/>
+        </w:rPr>
+        <w:t xml:space="preserve"> </w:t>
+      </w:r>
+      <w:r>
+        <w:rPr>
+          <w:sz w:val="22"/>
+          <w:szCs w:val="22"/>
+        </w:rPr>
+        <w:t xml:space="preserve">register with the default value of 1, and a ‘counter’ </w:t>
+      </w:r>
+      <w:r>
+        <w:rPr>
+          <w:sz w:val="22"/>
+          <w:szCs w:val="22"/>
+        </w:rPr>
+        <w:t xml:space="preserve">register </w:t>
+      </w:r>
+      <w:r>
+        <w:rPr>
+          <w:sz w:val="22"/>
+          <w:szCs w:val="22"/>
+        </w:rPr>
+        <w:t>that augments after a new data is consumed, are</w:t>
+      </w:r>
+      <w:r>
+        <w:rPr>
+          <w:sz w:val="22"/>
+          <w:szCs w:val="22"/>
+        </w:rPr>
+        <w:t xml:space="preserve"> used to</w:t>
+      </w:r>
+      <w:r>
+        <w:rPr>
+          <w:sz w:val="22"/>
+          <w:szCs w:val="22"/>
+        </w:rPr>
+        <w:t xml:space="preserve"> control the iteration</w:t>
+      </w:r>
+      <w:r>
+        <w:rPr>
+          <w:sz w:val="22"/>
+          <w:szCs w:val="22"/>
+        </w:rPr>
+        <w:t xml:space="preserve">, and the default value is 1. </w:t>
+      </w:r>
+      <w:r>
+        <w:rPr>
+          <w:sz w:val="22"/>
+          <w:szCs w:val="22"/>
+        </w:rPr>
+        <w:t>To prevent potential data loss, the 3-digit BCD ‘numWords’ is sliced, then concatenated and the result is stored in a separated ‘NNN’ register.</w:t>
+      </w:r>
+    </w:p>
+    <w:p>
+      <w:pPr>
+        <w:spacing w:line="240" w:lineRule="auto"/>
+        <w:rPr>
+          <w:sz w:val="22"/>
+          <w:szCs w:val="22"/>
+        </w:rPr>
+      </w:pPr>
+      <w:r>
+        <w:rPr>
+          <w:sz w:val="22"/>
+          <w:szCs w:val="22"/>
+        </w:rPr>
+        <w:t>Additionally, the</w:t>
+      </w:r>
+      <w:r>
+        <w:rPr>
+          <w:sz w:val="22"/>
+          <w:szCs w:val="22"/>
+        </w:rPr>
+        <w:t xml:space="preserve"> result</w:t>
+      </w:r>
+      <w:r>
+        <w:rPr>
+          <w:sz w:val="22"/>
+          <w:szCs w:val="22"/>
+        </w:rPr>
+        <w:t xml:space="preserve"> information</w:t>
+      </w:r>
+      <w:r>
+        <w:rPr>
+          <w:sz w:val="22"/>
+          <w:szCs w:val="22"/>
+        </w:rPr>
+        <w:t xml:space="preserve"> mentioned above is registered as well. To </w:t>
+      </w:r>
+      <w:r>
+        <w:rPr>
+          <w:sz w:val="22"/>
+          <w:szCs w:val="22"/>
+        </w:rPr>
+        <w:t>monitor</w:t>
+      </w:r>
+      <w:r>
+        <w:rPr>
+          <w:sz w:val="22"/>
+          <w:szCs w:val="22"/>
+        </w:rPr>
+        <w:t xml:space="preserve"> </w:t>
+      </w:r>
+      <w:r>
+        <w:rPr>
+          <w:sz w:val="22"/>
+          <w:szCs w:val="22"/>
+        </w:rPr>
+        <w:t xml:space="preserve">the flip of </w:t>
+      </w:r>
+      <w:r>
+        <w:rPr>
+          <w:sz w:val="22"/>
+          <w:szCs w:val="22"/>
+        </w:rPr>
+        <w:t xml:space="preserve">the </w:t>
+      </w:r>
+      <w:r>
+        <w:rPr>
+          <w:sz w:val="22"/>
+          <w:szCs w:val="22"/>
+        </w:rPr>
+        <w:t>`</w:t>
+      </w:r>
+      <w:r>
+        <w:rPr>
+          <w:sz w:val="22"/>
+          <w:szCs w:val="22"/>
+        </w:rPr>
+        <w:t>ctrlIn</w:t>
+      </w:r>
+      <w:r>
+        <w:rPr>
+          <w:sz w:val="22"/>
+          <w:szCs w:val="22"/>
+        </w:rPr>
+        <w:t>`</w:t>
+      </w:r>
+      <w:r>
+        <w:rPr>
+          <w:sz w:val="22"/>
+          <w:szCs w:val="22"/>
+        </w:rPr>
+        <w:t xml:space="preserve"> signal, its delayed </w:t>
+      </w:r>
+      <w:r>
+        <w:rPr>
+          <w:sz w:val="22"/>
+          <w:szCs w:val="22"/>
+        </w:rPr>
+        <w:t xml:space="preserve">version </w:t>
+      </w:r>
+      <w:r>
+        <w:rPr>
+          <w:sz w:val="22"/>
+          <w:szCs w:val="22"/>
+        </w:rPr>
+        <w:t xml:space="preserve">is recorded to compare with the current one. </w:t>
+      </w:r>
+    </w:p>
+    <w:p>
+      <w:pPr>
+        <w:spacing w:line="240" w:lineRule="auto"/>
+        <w:rPr>
+          <w:sz w:val="22"/>
+          <w:szCs w:val="22"/>
+        </w:rPr>
+      </w:pPr>
+      <w:r>
+        <w:rPr>
+          <w:sz w:val="22"/>
+          <w:szCs w:val="22"/>
+        </w:rPr>
+        <w:t>To remember the preceding and following three numbers</w:t>
+      </w:r>
+      <w:r>
+        <w:rPr>
+          <w:sz w:val="22"/>
+          <w:szCs w:val="22"/>
+        </w:rPr>
+        <w:t xml:space="preserve">, a </w:t>
+      </w:r>
+      <w:r>
+        <w:rPr>
+          <w:sz w:val="22"/>
+          <w:szCs w:val="22"/>
+        </w:rPr>
+        <w:t xml:space="preserve">shifting buffer consisting of seven 8-bit elements is declared. It is left shifted by one position when a new byte is received and appended subsequently. </w:t>
+      </w:r>
+      <w:r>
+        <w:rPr>
+          <w:sz w:val="22"/>
+          <w:szCs w:val="22"/>
+        </w:rPr>
+        <w:t xml:space="preserve">The currently stored max value is compared to the centre value of buffer, namely, </w:t>
+      </w:r>
+      <w:r>
+        <w:rPr>
+          <w:sz w:val="22"/>
+          <w:szCs w:val="22"/>
+        </w:rPr>
+        <w:t>buffer[</w:t>
+      </w:r>
+      <w:r>
+        <w:rPr>
+          <w:sz w:val="22"/>
+          <w:szCs w:val="22"/>
+        </w:rPr>
+        <w:t>3], and updated</w:t>
+      </w:r>
+      <w:r>
+        <w:rPr>
+          <w:sz w:val="22"/>
+          <w:szCs w:val="22"/>
+        </w:rPr>
+        <w:t xml:space="preserve"> </w:t>
+      </w:r>
+      <w:r>
+        <w:rPr>
+          <w:sz w:val="22"/>
+          <w:szCs w:val="22"/>
+        </w:rPr>
+        <w:t>if</w:t>
+      </w:r>
+      <w:r>
+        <w:rPr>
+          <w:sz w:val="22"/>
+          <w:szCs w:val="22"/>
+        </w:rPr>
+        <w:t xml:space="preserve"> the lat</w:t>
+      </w:r>
+      <w:r>
+        <w:rPr>
+          <w:sz w:val="22"/>
+          <w:szCs w:val="22"/>
+        </w:rPr>
+        <w:t>t</w:t>
+      </w:r>
+      <w:r>
+        <w:rPr>
+          <w:sz w:val="22"/>
+          <w:szCs w:val="22"/>
+        </w:rPr>
+        <w:t xml:space="preserve">er one is </w:t>
+      </w:r>
+      <w:r>
+        <w:rPr>
+          <w:sz w:val="22"/>
+          <w:szCs w:val="22"/>
+        </w:rPr>
+        <w:t>greater</w:t>
+      </w:r>
+      <w:r>
+        <w:rPr>
+          <w:sz w:val="22"/>
+          <w:szCs w:val="22"/>
+        </w:rPr>
+        <w:t>.</w:t>
+      </w:r>
+      <w:r>
+        <w:rPr>
+          <w:sz w:val="22"/>
+          <w:szCs w:val="22"/>
+        </w:rPr>
+        <w:t xml:space="preserve"> </w:t>
+      </w:r>
+      <w:r>
+        <w:rPr>
+          <w:sz w:val="22"/>
+          <w:szCs w:val="22"/>
+        </w:rPr>
+        <w:t xml:space="preserve">Furthermore, </w:t>
+      </w:r>
+      <w:r>
+        <w:rPr>
+          <w:sz w:val="22"/>
+          <w:szCs w:val="22"/>
+        </w:rPr>
+        <w:t xml:space="preserve">the output </w:t>
+      </w:r>
+      <w:r>
+        <w:rPr>
+          <w:sz w:val="22"/>
+          <w:szCs w:val="22"/>
+        </w:rPr>
+        <w:t>‘</w:t>
+      </w:r>
+      <w:r>
+        <w:rPr>
+          <w:sz w:val="22"/>
+          <w:szCs w:val="22"/>
+        </w:rPr>
+        <w:t>byte</w:t>
+      </w:r>
+      <w:r>
+        <w:rPr>
+          <w:sz w:val="22"/>
+          <w:szCs w:val="22"/>
+        </w:rPr>
+        <w:t>’</w:t>
+      </w:r>
+      <w:r>
+        <w:rPr>
+          <w:sz w:val="22"/>
+          <w:szCs w:val="22"/>
+        </w:rPr>
+        <w:t xml:space="preserve"> points to the last entry of this shifting buffer.</w:t>
+      </w:r>
+    </w:p>
+    <w:p>
+      <w:pPr>
+        <w:spacing w:line="240" w:lineRule="auto"/>
+        <w:rPr>
+          <w:sz w:val="22"/>
+          <w:szCs w:val="22"/>
+        </w:rPr>
+      </w:pPr>
+      <w:r>
+        <w:rPr>
+          <w:sz w:val="22"/>
+          <w:szCs w:val="22"/>
+        </w:rPr>
+        <w:t xml:space="preserve">Therefore, </w:t>
+      </w:r>
+      <w:r>
+        <w:rPr>
+          <w:sz w:val="22"/>
+          <w:szCs w:val="22"/>
+        </w:rPr>
+        <w:t xml:space="preserve">in the first three retrieving cycles, the buffer is being filled but no comparison is performed. Subsequently, NNN–3 data are retrieved and appended in the buffer. Finally, a dummy value, </w:t>
+      </w:r>
+      <w:r>
+        <w:rPr>
+          <w:color w:val="FF0000"/>
+          <w:sz w:val="22"/>
+          <w:szCs w:val="22"/>
+        </w:rPr>
+        <w:t>0x8</w:t>
+      </w:r>
+      <w:r>
+        <w:rPr>
+          <w:sz w:val="22"/>
+          <w:szCs w:val="22"/>
+        </w:rPr>
+        <w:t xml:space="preserve">, </w:t>
+      </w:r>
+      <w:r>
+        <w:rPr>
+          <w:sz w:val="22"/>
+          <w:szCs w:val="22"/>
+        </w:rPr>
+        <w:t xml:space="preserve">is inserted </w:t>
+      </w:r>
+      <w:r>
+        <w:rPr>
+          <w:sz w:val="22"/>
+          <w:szCs w:val="22"/>
+        </w:rPr>
+        <w:t>for three times</w:t>
+      </w:r>
+      <w:r>
+        <w:rPr>
+          <w:sz w:val="22"/>
+          <w:szCs w:val="22"/>
+        </w:rPr>
+        <w:t xml:space="preserve"> to ensure the last generated number is shifted to the centre position.</w:t>
+      </w:r>
+      <w:r>
+        <w:rPr>
+          <w:sz w:val="22"/>
+          <w:szCs w:val="22"/>
+        </w:rPr>
+        <w:t xml:space="preserve"> </w:t>
+      </w:r>
+      <w:r>
+        <w:rPr>
+          <w:sz w:val="22"/>
+          <w:szCs w:val="22"/>
+        </w:rPr>
+        <w:t xml:space="preserve">The output </w:t>
+      </w:r>
+      <w:r>
+        <w:rPr>
+          <w:sz w:val="22"/>
+          <w:szCs w:val="22"/>
+        </w:rPr>
+        <w:t>`</w:t>
+      </w:r>
+      <w:r>
+        <w:rPr>
+          <w:sz w:val="22"/>
+          <w:szCs w:val="22"/>
+        </w:rPr>
+        <w:t>byte</w:t>
+      </w:r>
+      <w:r>
+        <w:rPr>
+          <w:sz w:val="22"/>
+          <w:szCs w:val="22"/>
+        </w:rPr>
+        <w:t>`</w:t>
+      </w:r>
+      <w:r>
+        <w:rPr>
+          <w:sz w:val="22"/>
+          <w:szCs w:val="22"/>
+        </w:rPr>
+        <w:t xml:space="preserve"> points to the last entry of this shifting buffer.</w:t>
+      </w:r>
+    </w:p>
+    <w:p>
+      <w:pPr>
+        <w:keepNext/>
+        <w:spacing w:line="240" w:lineRule="auto"/>
+      </w:pPr>
+      <w:r>
+        <w:rPr>
+          <w:noProof/>
+          <w:sz w:val="22"/>
+          <w:szCs w:val="22"/>
+        </w:rPr>
+        <w:lastRenderedPageBreak/>
         <w:drawing>
           <wp:inline distT="0" distB="0" distL="0" distR="0" wp14:anchorId="018DA4D4" wp14:editId="7BD33FB5">
             <wp:extent cx="5375747" cy="3385185"/>
@@ -2353,7 +2502,7 @@
                     <pic:cNvPicPr/>
                   </pic:nvPicPr>
                   <pic:blipFill>
-                    <a:blip r:embed="rId8"/>
+                    <a:blip r:embed="rId9"/>
                     <a:stretch>
                       <a:fillRect/>
                     </a:stretch>
@@ -2377,10 +2526,6 @@
     <w:p>
       <w:pPr>
         <w:pStyle w:val="Caption"/>
-        <w:rPr>
-          <w:sz w:val="22"/>
-          <w:szCs w:val="22"/>
-        </w:rPr>
       </w:pPr>
       <w:r>
         <w:t xml:space="preserve">Figure </w:t>
@@ -2398,12 +2543,16 @@
         <w:rPr>
           <w:noProof/>
         </w:rPr>
-        <w:t>3</w:t>
+        <w:t>4</w:t>
       </w:r>
       <w:r>
         <w:fldChar w:fldCharType="end"/>
       </w:r>
-    </w:p>
+      <w:r>
+        <w:t>: ASM chart of data processor</w:t>
+      </w:r>
+    </w:p>
+    <w:p/>
     <w:p>
       <w:pPr>
         <w:spacing w:line="240" w:lineRule="auto"/>
@@ -2447,7 +2596,16 @@
           <w:sz w:val="22"/>
           <w:szCs w:val="22"/>
         </w:rPr>
-        <w:t>Figure 3</w:t>
+        <w:t xml:space="preserve">Figure </w:t>
+      </w:r>
+      <w:r>
+        <w:rPr>
+          <w:i/>
+          <w:iCs/>
+          <w:sz w:val="22"/>
+          <w:szCs w:val="22"/>
+        </w:rPr>
+        <w:t>4</w:t>
       </w:r>
       <w:r>
         <w:rPr>
@@ -2827,6 +2985,7 @@
           <w:sz w:val="22"/>
           <w:szCs w:val="22"/>
         </w:rPr>
+        <w:lastRenderedPageBreak/>
         <w:drawing>
           <wp:inline distT="0" distB="0" distL="0" distR="0" wp14:anchorId="1D312783" wp14:editId="4109ACE4">
             <wp:extent cx="5731510" cy="3185795"/>
@@ -2843,7 +3002,7 @@
                     <pic:cNvPicPr/>
                   </pic:nvPicPr>
                   <pic:blipFill>
-                    <a:blip r:embed="rId9"/>
+                    <a:blip r:embed="rId10"/>
                     <a:stretch>
                       <a:fillRect/>
                     </a:stretch>
@@ -2867,10 +3026,6 @@
     <w:p>
       <w:pPr>
         <w:pStyle w:val="Caption"/>
-        <w:rPr>
-          <w:sz w:val="22"/>
-          <w:szCs w:val="22"/>
-        </w:rPr>
       </w:pPr>
       <w:r>
         <w:t xml:space="preserve">Figure </w:t>
@@ -2888,12 +3043,16 @@
         <w:rPr>
           <w:noProof/>
         </w:rPr>
-        <w:t>4</w:t>
+        <w:t>5</w:t>
       </w:r>
       <w:r>
         <w:fldChar w:fldCharType="end"/>
       </w:r>
-    </w:p>
+      <w:r>
+        <w:t>: Data processor simulation waveform</w:t>
+      </w:r>
+    </w:p>
+    <w:p/>
     <w:p>
       <w:pPr>
         <w:spacing w:line="240" w:lineRule="auto"/>
@@ -2923,30 +3082,23 @@
           <w:sz w:val="22"/>
           <w:szCs w:val="22"/>
         </w:rPr>
-        <w:t>Figure 4</w:t>
-      </w:r>
-      <w:r>
-        <w:rPr>
-          <w:sz w:val="22"/>
-          <w:szCs w:val="22"/>
-        </w:rPr>
-        <w:t>. The `ctrlOut` signal is flipped when requesting a new data, which is further processed once `</w:t>
-      </w:r>
-      <w:proofErr w:type="spellStart"/>
-      <w:r>
-        <w:rPr>
-          <w:sz w:val="22"/>
-          <w:szCs w:val="22"/>
-        </w:rPr>
-        <w:t>ctrlIn</w:t>
-      </w:r>
-      <w:proofErr w:type="spellEnd"/>
-      <w:r>
-        <w:rPr>
-          <w:sz w:val="22"/>
-          <w:szCs w:val="22"/>
-        </w:rPr>
-        <w:t>` is toggled. It is confirmed that the buffer is updated as expected and its centre value is compared with the stored max one. In conclusion, the data processor behaves as intended in this standalone simulation.</w:t>
+        <w:t xml:space="preserve">Figure </w:t>
+      </w:r>
+      <w:r>
+        <w:rPr>
+          <w:i/>
+          <w:iCs/>
+          <w:sz w:val="22"/>
+          <w:szCs w:val="22"/>
+        </w:rPr>
+        <w:t>5</w:t>
+      </w:r>
+      <w:r>
+        <w:rPr>
+          <w:sz w:val="22"/>
+          <w:szCs w:val="22"/>
+        </w:rPr>
+        <w:t>. The `ctrlOut` signal is flipped when requesting a new data, which is further processed once `ctrlIn` is toggled. It is confirmed that the buffer is updated as expected and its centre value is compared with the stored max one. In conclusion, the data processor behaves as intended in this standalone simulation.</w:t>
       </w:r>
     </w:p>
     <w:p>
@@ -3124,22 +3276,53 @@
           <w:sz w:val="22"/>
           <w:szCs w:val="22"/>
         </w:rPr>
-        <w:t>a ring buffer and dispatcher are introduced to decouple the Tx. and Rx</w:t>
-      </w:r>
-      <w:r>
-        <w:rPr>
-          <w:sz w:val="22"/>
-          <w:szCs w:val="22"/>
-        </w:rPr>
-        <w:t xml:space="preserve">, as shown in Figure </w:t>
-      </w:r>
-      <w:r>
-        <w:rPr>
-          <w:color w:val="FF0000"/>
+        <w:t xml:space="preserve">a ring buffer and dispatcher are introduced to decouple the </w:t>
+      </w:r>
+      <w:r>
+        <w:rPr>
+          <w:sz w:val="22"/>
+          <w:szCs w:val="22"/>
+        </w:rPr>
+        <w:t>TX</w:t>
+      </w:r>
+      <w:r>
+        <w:rPr>
+          <w:sz w:val="22"/>
+          <w:szCs w:val="22"/>
+        </w:rPr>
+        <w:t xml:space="preserve"> and R</w:t>
+      </w:r>
+      <w:r>
+        <w:rPr>
           <w:sz w:val="22"/>
           <w:szCs w:val="22"/>
         </w:rPr>
         <w:t>X</w:t>
+      </w:r>
+      <w:r>
+        <w:rPr>
+          <w:sz w:val="22"/>
+          <w:szCs w:val="22"/>
+        </w:rPr>
+        <w:t xml:space="preserve">, as shown in </w:t>
+      </w:r>
+      <w:r>
+        <w:rPr>
+          <w:i/>
+          <w:iCs/>
+          <w:sz w:val="22"/>
+          <w:szCs w:val="22"/>
+        </w:rPr>
+        <w:t xml:space="preserve">Figure </w:t>
+      </w:r>
+      <w:r>
+        <w:rPr>
+          <w:i/>
+          <w:iCs/>
+          <w:sz w:val="22"/>
+          <w:szCs w:val="22"/>
+        </w:rPr>
+        <w:t>6</w:t>
       </w:r>
       <w:r>
         <w:rPr>
@@ -3212,7 +3395,7 @@
                     <pic:cNvPicPr/>
                   </pic:nvPicPr>
                   <pic:blipFill>
-                    <a:blip r:embed="rId10"/>
+                    <a:blip r:embed="rId11"/>
                     <a:stretch>
                       <a:fillRect/>
                     </a:stretch>
@@ -3257,11 +3440,17 @@
         <w:rPr>
           <w:noProof/>
         </w:rPr>
-        <w:t>5</w:t>
+        <w:t>6</w:t>
       </w:r>
       <w:r>
         <w:fldChar w:fldCharType="end"/>
       </w:r>
+      <w:r>
+        <w:t xml:space="preserve">: </w:t>
+      </w:r>
+      <w:r>
+        <w:t>Block-level diagram of RX controller</w:t>
+      </w:r>
     </w:p>
     <w:p>
       <w:pPr>
@@ -3353,15 +3542,25 @@
           <w:sz w:val="22"/>
           <w:szCs w:val="22"/>
         </w:rPr>
-        <w:t xml:space="preserve">The interconnection of submodules is illustrated in Figure </w:t>
-      </w:r>
-      <w:r>
-        <w:rPr>
-          <w:color w:val="FF0000"/>
-          <w:sz w:val="22"/>
-          <w:szCs w:val="22"/>
-        </w:rPr>
-        <w:t>X</w:t>
+        <w:t xml:space="preserve">The interconnection of submodules is illustrated in </w:t>
+      </w:r>
+      <w:r>
+        <w:rPr>
+          <w:i/>
+          <w:iCs/>
+          <w:sz w:val="22"/>
+          <w:szCs w:val="22"/>
+        </w:rPr>
+        <w:t xml:space="preserve">Figure </w:t>
+      </w:r>
+      <w:r>
+        <w:rPr>
+          <w:i/>
+          <w:iCs/>
+          <w:sz w:val="22"/>
+          <w:szCs w:val="22"/>
+        </w:rPr>
+        <w:t>7</w:t>
       </w:r>
       <w:r>
         <w:rPr>
@@ -3394,11 +3593,8 @@
     </w:p>
     <w:p>
       <w:pPr>
+        <w:keepNext/>
         <w:spacing w:line="240" w:lineRule="auto"/>
-        <w:rPr>
-          <w:sz w:val="22"/>
-          <w:szCs w:val="22"/>
-        </w:rPr>
       </w:pPr>
       <w:r>
         <w:rPr>
@@ -3422,7 +3618,7 @@
                     <pic:cNvPicPr/>
                   </pic:nvPicPr>
                   <pic:blipFill>
-                    <a:blip r:embed="rId11"/>
+                    <a:blip r:embed="rId12"/>
                     <a:stretch>
                       <a:fillRect/>
                     </a:stretch>
@@ -3445,6 +3641,40 @@
     </w:p>
     <w:p>
       <w:pPr>
+        <w:pStyle w:val="Caption"/>
+        <w:rPr>
+          <w:color w:val="auto"/>
+          <w:sz w:val="22"/>
+          <w:szCs w:val="22"/>
+        </w:rPr>
+      </w:pPr>
+      <w:r>
+        <w:t xml:space="preserve">Figure </w:t>
+      </w:r>
+      <w:r>
+        <w:fldChar w:fldCharType="begin"/>
+      </w:r>
+      <w:r>
+        <w:instrText xml:space="preserve"> SEQ Figure \* ARABIC </w:instrText>
+      </w:r>
+      <w:r>
+        <w:fldChar w:fldCharType="separate"/>
+      </w:r>
+      <w:r>
+        <w:rPr>
+          <w:noProof/>
+        </w:rPr>
+        <w:t>7</w:t>
+      </w:r>
+      <w:r>
+        <w:fldChar w:fldCharType="end"/>
+      </w:r>
+      <w:r>
+        <w:t>: Block-level diagram of overall command processor</w:t>
+      </w:r>
+    </w:p>
+    <w:p>
+      <w:pPr>
         <w:spacing w:line="240" w:lineRule="auto"/>
         <w:rPr>
           <w:sz w:val="22"/>
@@ -3556,7 +3786,15 @@
           <w:sz w:val="22"/>
           <w:szCs w:val="22"/>
         </w:rPr>
-        <w:t xml:space="preserve"> another</w:t>
+        <w:t xml:space="preserve"> </w:t>
+      </w:r>
+      <w:r>
+        <w:rPr>
+          <w:sz w:val="22"/>
+          <w:szCs w:val="22"/>
+        </w:rPr>
+        <w:lastRenderedPageBreak/>
+        <w:t>another</w:t>
       </w:r>
       <w:r>
         <w:rPr>
@@ -3589,11 +3827,8 @@
     </w:p>
     <w:p>
       <w:pPr>
+        <w:keepNext/>
         <w:spacing w:line="240" w:lineRule="auto"/>
-        <w:rPr>
-          <w:sz w:val="22"/>
-          <w:szCs w:val="22"/>
-        </w:rPr>
       </w:pPr>
       <w:r>
         <w:rPr>
@@ -3601,7 +3836,6 @@
           <w:sz w:val="22"/>
           <w:szCs w:val="22"/>
         </w:rPr>
-        <w:lastRenderedPageBreak/>
         <w:drawing>
           <wp:inline distT="0" distB="0" distL="0" distR="0" wp14:anchorId="31A80712" wp14:editId="2C2D593D">
             <wp:extent cx="5731510" cy="4102100"/>
@@ -3618,7 +3852,7 @@
                     <pic:cNvPicPr/>
                   </pic:nvPicPr>
                   <pic:blipFill>
-                    <a:blip r:embed="rId12"/>
+                    <a:blip r:embed="rId13"/>
                     <a:stretch>
                       <a:fillRect/>
                     </a:stretch>
@@ -3641,12 +3875,179 @@
     </w:p>
     <w:p>
       <w:pPr>
+        <w:pStyle w:val="Caption"/>
+      </w:pPr>
+      <w:r>
+        <w:t xml:space="preserve">Figure </w:t>
+      </w:r>
+      <w:r>
+        <w:fldChar w:fldCharType="begin"/>
+      </w:r>
+      <w:r>
+        <w:instrText xml:space="preserve"> SEQ Figure \* ARABIC </w:instrText>
+      </w:r>
+      <w:r>
+        <w:fldChar w:fldCharType="separate"/>
+      </w:r>
+      <w:r>
+        <w:rPr>
+          <w:noProof/>
+        </w:rPr>
+        <w:t>8</w:t>
+      </w:r>
+      <w:r>
+        <w:fldChar w:fldCharType="end"/>
+      </w:r>
+      <w:r>
+        <w:t>: ASM of command processor</w:t>
+      </w:r>
+    </w:p>
+    <w:p/>
+    <w:p>
+      <w:pPr>
         <w:spacing w:line="240" w:lineRule="auto"/>
         <w:rPr>
           <w:sz w:val="22"/>
           <w:szCs w:val="22"/>
         </w:rPr>
       </w:pPr>
+      <w:r>
+        <w:rPr>
+          <w:sz w:val="22"/>
+          <w:szCs w:val="22"/>
+        </w:rPr>
+        <w:t xml:space="preserve">Based on the </w:t>
+      </w:r>
+      <w:r>
+        <w:rPr>
+          <w:sz w:val="22"/>
+          <w:szCs w:val="22"/>
+        </w:rPr>
+        <w:t xml:space="preserve">ASM chart of scheduler in </w:t>
+      </w:r>
+      <w:r>
+        <w:rPr>
+          <w:i/>
+          <w:iCs/>
+          <w:sz w:val="22"/>
+          <w:szCs w:val="22"/>
+        </w:rPr>
+        <w:t xml:space="preserve">Figure </w:t>
+      </w:r>
+      <w:r>
+        <w:rPr>
+          <w:i/>
+          <w:iCs/>
+          <w:sz w:val="22"/>
+          <w:szCs w:val="22"/>
+        </w:rPr>
+        <w:t>8</w:t>
+      </w:r>
+      <w:r>
+        <w:rPr>
+          <w:sz w:val="22"/>
+          <w:szCs w:val="22"/>
+        </w:rPr>
+        <w:t xml:space="preserve">, </w:t>
+      </w:r>
+      <w:r>
+        <w:rPr>
+          <w:sz w:val="22"/>
+          <w:szCs w:val="22"/>
+        </w:rPr>
+        <w:t xml:space="preserve">the workflow is triggered </w:t>
+      </w:r>
+      <w:r>
+        <w:rPr>
+          <w:sz w:val="22"/>
+          <w:szCs w:val="22"/>
+        </w:rPr>
+        <w:t>if</w:t>
+      </w:r>
+      <w:r>
+        <w:rPr>
+          <w:sz w:val="22"/>
+          <w:szCs w:val="22"/>
+        </w:rPr>
+        <w:t xml:space="preserve"> </w:t>
+      </w:r>
+      <w:r>
+        <w:rPr>
+          <w:sz w:val="22"/>
+          <w:szCs w:val="22"/>
+        </w:rPr>
+        <w:t>any of the</w:t>
+      </w:r>
+      <w:r>
+        <w:rPr>
+          <w:sz w:val="22"/>
+          <w:szCs w:val="22"/>
+        </w:rPr>
+        <w:t xml:space="preserve"> </w:t>
+      </w:r>
+      <w:r>
+        <w:rPr>
+          <w:sz w:val="22"/>
+          <w:szCs w:val="22"/>
+        </w:rPr>
+        <w:t xml:space="preserve">defined </w:t>
+      </w:r>
+      <w:r>
+        <w:rPr>
+          <w:sz w:val="22"/>
+          <w:szCs w:val="22"/>
+        </w:rPr>
+        <w:t>command</w:t>
+      </w:r>
+      <w:r>
+        <w:rPr>
+          <w:sz w:val="22"/>
+          <w:szCs w:val="22"/>
+        </w:rPr>
+        <w:t xml:space="preserve"> is recongised</w:t>
+      </w:r>
+      <w:r>
+        <w:rPr>
+          <w:sz w:val="22"/>
+          <w:szCs w:val="22"/>
+        </w:rPr>
+        <w:t>.</w:t>
+      </w:r>
+      <w:r>
+        <w:rPr>
+          <w:sz w:val="22"/>
+          <w:szCs w:val="22"/>
+        </w:rPr>
+        <w:t xml:space="preserve"> Before any further operations, it is essential to print a </w:t>
+      </w:r>
+      <w:r>
+        <w:rPr>
+          <w:sz w:val="22"/>
+          <w:szCs w:val="22"/>
+        </w:rPr>
+        <w:t>delim</w:t>
+      </w:r>
+      <w:r>
+        <w:rPr>
+          <w:sz w:val="22"/>
+          <w:szCs w:val="22"/>
+        </w:rPr>
+        <w:t>ite</w:t>
+      </w:r>
+      <w:r>
+        <w:rPr>
+          <w:sz w:val="22"/>
+          <w:szCs w:val="22"/>
+        </w:rPr>
+        <w:t>r, including CF, LR</w:t>
+      </w:r>
+      <w:r>
+        <w:rPr>
+          <w:sz w:val="22"/>
+          <w:szCs w:val="22"/>
+        </w:rPr>
+        <w:t xml:space="preserve">, in advance. </w:t>
+      </w:r>
     </w:p>
     <w:p>
       <w:pPr>
@@ -3661,142 +4062,6 @@
           <w:sz w:val="22"/>
           <w:szCs w:val="22"/>
         </w:rPr>
-        <w:t xml:space="preserve">Based on the </w:t>
-      </w:r>
-      <w:r>
-        <w:rPr>
-          <w:sz w:val="22"/>
-          <w:szCs w:val="22"/>
-        </w:rPr>
-        <w:t xml:space="preserve">ASM chart of scheduler in Figure </w:t>
-      </w:r>
-      <w:r>
-        <w:rPr>
-          <w:color w:val="FF0000"/>
-          <w:sz w:val="22"/>
-          <w:szCs w:val="22"/>
-        </w:rPr>
-        <w:t>X</w:t>
-      </w:r>
-      <w:r>
-        <w:rPr>
-          <w:sz w:val="22"/>
-          <w:szCs w:val="22"/>
-        </w:rPr>
-        <w:t xml:space="preserve">, </w:t>
-      </w:r>
-      <w:r>
-        <w:rPr>
-          <w:sz w:val="22"/>
-          <w:szCs w:val="22"/>
-        </w:rPr>
-        <w:t xml:space="preserve">the workflow is triggered </w:t>
-      </w:r>
-      <w:r>
-        <w:rPr>
-          <w:sz w:val="22"/>
-          <w:szCs w:val="22"/>
-        </w:rPr>
-        <w:t>if</w:t>
-      </w:r>
-      <w:r>
-        <w:rPr>
-          <w:sz w:val="22"/>
-          <w:szCs w:val="22"/>
-        </w:rPr>
-        <w:t xml:space="preserve"> </w:t>
-      </w:r>
-      <w:r>
-        <w:rPr>
-          <w:sz w:val="22"/>
-          <w:szCs w:val="22"/>
-        </w:rPr>
-        <w:t>any of the</w:t>
-      </w:r>
-      <w:r>
-        <w:rPr>
-          <w:sz w:val="22"/>
-          <w:szCs w:val="22"/>
-        </w:rPr>
-        <w:t xml:space="preserve"> </w:t>
-      </w:r>
-      <w:r>
-        <w:rPr>
-          <w:sz w:val="22"/>
-          <w:szCs w:val="22"/>
-        </w:rPr>
-        <w:t xml:space="preserve">defined </w:t>
-      </w:r>
-      <w:r>
-        <w:rPr>
-          <w:sz w:val="22"/>
-          <w:szCs w:val="22"/>
-        </w:rPr>
-        <w:t>command</w:t>
-      </w:r>
-      <w:r>
-        <w:rPr>
-          <w:sz w:val="22"/>
-          <w:szCs w:val="22"/>
-        </w:rPr>
-        <w:t xml:space="preserve"> is recongised</w:t>
-      </w:r>
-      <w:r>
-        <w:rPr>
-          <w:sz w:val="22"/>
-          <w:szCs w:val="22"/>
-        </w:rPr>
-        <w:t>.</w:t>
-      </w:r>
-      <w:r>
-        <w:rPr>
-          <w:sz w:val="22"/>
-          <w:szCs w:val="22"/>
-        </w:rPr>
-        <w:t xml:space="preserve"> Before any further operations, it is essential to print a </w:t>
-      </w:r>
-      <w:r>
-        <w:rPr>
-          <w:sz w:val="22"/>
-          <w:szCs w:val="22"/>
-        </w:rPr>
-        <w:t>delim</w:t>
-      </w:r>
-      <w:r>
-        <w:rPr>
-          <w:sz w:val="22"/>
-          <w:szCs w:val="22"/>
-        </w:rPr>
-        <w:t>ite</w:t>
-      </w:r>
-      <w:r>
-        <w:rPr>
-          <w:sz w:val="22"/>
-          <w:szCs w:val="22"/>
-        </w:rPr>
-        <w:t>r, including CF, LR</w:t>
-      </w:r>
-      <w:r>
-        <w:rPr>
-          <w:sz w:val="22"/>
-          <w:szCs w:val="22"/>
-        </w:rPr>
-        <w:t xml:space="preserve">, in advance. </w:t>
-      </w:r>
-    </w:p>
-    <w:p>
-      <w:pPr>
-        <w:spacing w:line="240" w:lineRule="auto"/>
-        <w:rPr>
-          <w:sz w:val="22"/>
-          <w:szCs w:val="22"/>
-        </w:rPr>
-      </w:pPr>
-      <w:r>
-        <w:rPr>
-          <w:sz w:val="22"/>
-          <w:szCs w:val="22"/>
-        </w:rPr>
         <w:t>F</w:t>
       </w:r>
       <w:r>
@@ -3841,15 +4106,6 @@
         </w:rPr>
         <w:t xml:space="preserve">results from the data processor are binary encoded, while it is the ASCII code that can be interpreted by PuTTY. </w:t>
       </w:r>
-    </w:p>
-    <w:p>
-      <w:pPr>
-        <w:spacing w:line="240" w:lineRule="auto"/>
-        <w:rPr>
-          <w:sz w:val="22"/>
-          <w:szCs w:val="22"/>
-        </w:rPr>
-      </w:pPr>
     </w:p>
     <w:p>
       <w:pPr>
@@ -3862,6 +4118,7 @@
           <w:sz w:val="22"/>
           <w:szCs w:val="22"/>
         </w:rPr>
+        <w:lastRenderedPageBreak/>
         <w:drawing>
           <wp:inline distT="0" distB="0" distL="0" distR="0" wp14:anchorId="2FC070FB" wp14:editId="1B73B18D">
             <wp:extent cx="5731510" cy="1959490"/>
@@ -3878,7 +4135,7 @@
                     <pic:cNvPicPr/>
                   </pic:nvPicPr>
                   <pic:blipFill>
-                    <a:blip r:embed="rId13"/>
+                    <a:blip r:embed="rId14"/>
                     <a:stretch>
                       <a:fillRect/>
                     </a:stretch>
@@ -3902,10 +4159,6 @@
     <w:p>
       <w:pPr>
         <w:pStyle w:val="Caption"/>
-        <w:rPr>
-          <w:sz w:val="22"/>
-          <w:szCs w:val="22"/>
-        </w:rPr>
       </w:pPr>
       <w:r>
         <w:t xml:space="preserve">Figure </w:t>
@@ -3923,12 +4176,16 @@
         <w:rPr>
           <w:noProof/>
         </w:rPr>
-        <w:t>6</w:t>
+        <w:t>9</w:t>
       </w:r>
       <w:r>
         <w:fldChar w:fldCharType="end"/>
       </w:r>
-    </w:p>
+      <w:r>
+        <w:t>: Command processor simulation waveform</w:t>
+      </w:r>
+    </w:p>
+    <w:p/>
     <w:p>
       <w:pPr>
         <w:spacing w:line="240" w:lineRule="auto"/>
@@ -3942,23 +4199,39 @@
           <w:sz w:val="22"/>
           <w:szCs w:val="22"/>
         </w:rPr>
-        <w:lastRenderedPageBreak/>
-        <w:t xml:space="preserve">The simulation result is illustrated in Figure </w:t>
-      </w:r>
-      <w:r>
-        <w:rPr>
-          <w:color w:val="FF0000"/>
-          <w:sz w:val="22"/>
-          <w:szCs w:val="22"/>
-        </w:rPr>
-        <w:t>X</w:t>
-      </w:r>
-      <w:r>
-        <w:rPr>
-          <w:sz w:val="22"/>
-          <w:szCs w:val="22"/>
-        </w:rPr>
-        <w:t>. At the beginning, the a012 sequence is successfully identified</w:t>
+        <w:t xml:space="preserve">The simulation result is illustrated in </w:t>
+      </w:r>
+      <w:r>
+        <w:rPr>
+          <w:i/>
+          <w:iCs/>
+          <w:sz w:val="22"/>
+          <w:szCs w:val="22"/>
+        </w:rPr>
+        <w:t xml:space="preserve">Figure </w:t>
+      </w:r>
+      <w:r>
+        <w:rPr>
+          <w:i/>
+          <w:iCs/>
+          <w:sz w:val="22"/>
+          <w:szCs w:val="22"/>
+        </w:rPr>
+        <w:t>9</w:t>
+      </w:r>
+      <w:r>
+        <w:rPr>
+          <w:sz w:val="22"/>
+          <w:szCs w:val="22"/>
+        </w:rPr>
+        <w:t>.</w:t>
+      </w:r>
+      <w:r>
+        <w:rPr>
+          <w:sz w:val="22"/>
+          <w:szCs w:val="22"/>
+        </w:rPr>
+        <w:t xml:space="preserve"> At the beginning, the a012 sequence is successfully identified</w:t>
       </w:r>
       <w:r>
         <w:rPr>
@@ -4095,6 +4368,15 @@
         </w:rPr>
         <w:t xml:space="preserve">module combination loop in the handshake logic. Consequently, a register is added in the handshake path so that the risk of instability is eliminated. </w:t>
       </w:r>
+    </w:p>
+    <w:p>
+      <w:pPr>
+        <w:spacing w:line="240" w:lineRule="auto"/>
+        <w:rPr>
+          <w:sz w:val="22"/>
+          <w:szCs w:val="22"/>
+        </w:rPr>
+      </w:pPr>
     </w:p>
     <w:p>
       <w:pPr>
@@ -4396,16 +4678,17 @@
           <w:szCs w:val="22"/>
           <w:lang w:val="en-US"/>
         </w:rPr>
-        <w:t xml:space="preserve"> table </w:t>
-      </w:r>
-      <w:r>
-        <w:rPr>
-          <w:color w:val="FF0000"/>
+        <w:t xml:space="preserve"> </w:t>
+      </w:r>
+      <w:r>
+        <w:rPr>
+          <w:i/>
+          <w:iCs/>
           <w:sz w:val="22"/>
           <w:szCs w:val="22"/>
           <w:lang w:val="en-US"/>
         </w:rPr>
-        <w:t>X</w:t>
+        <w:t>Table 1</w:t>
       </w:r>
       <w:r>
         <w:rPr>
@@ -4424,6 +4707,45 @@
           <w:szCs w:val="22"/>
         </w:rPr>
       </w:pPr>
+    </w:p>
+    <w:p>
+      <w:pPr>
+        <w:spacing w:line="240" w:lineRule="auto"/>
+        <w:rPr>
+          <w:sz w:val="22"/>
+          <w:szCs w:val="22"/>
+        </w:rPr>
+      </w:pPr>
+    </w:p>
+    <w:p>
+      <w:pPr>
+        <w:pStyle w:val="Caption"/>
+        <w:keepNext/>
+      </w:pPr>
+      <w:r>
+        <w:t xml:space="preserve">Table </w:t>
+      </w:r>
+      <w:r>
+        <w:fldChar w:fldCharType="begin"/>
+      </w:r>
+      <w:r>
+        <w:instrText xml:space="preserve"> SEQ Table \* ARABIC </w:instrText>
+      </w:r>
+      <w:r>
+        <w:fldChar w:fldCharType="separate"/>
+      </w:r>
+      <w:r>
+        <w:rPr>
+          <w:noProof/>
+        </w:rPr>
+        <w:t>1</w:t>
+      </w:r>
+      <w:r>
+        <w:fldChar w:fldCharType="end"/>
+      </w:r>
+      <w:r>
+        <w:t>: System evaluation</w:t>
+      </w:r>
     </w:p>
     <w:tbl>
       <w:tblPr>
@@ -4665,7 +4987,7 @@
         </w:tc>
         <w:tc>
           <w:tcPr>
-            <w:tcW w:w="328" w:type="pct"/>
+            <w:tcW w:w="329" w:type="pct"/>
             <w:shd w:val="clear" w:color="auto" w:fill="D1D1D1" w:themeFill="background2" w:themeFillShade="E6"/>
           </w:tcPr>
           <w:p>
@@ -4823,7 +5145,7 @@
         </w:tc>
         <w:tc>
           <w:tcPr>
-            <w:tcW w:w="328" w:type="pct"/>
+            <w:tcW w:w="329" w:type="pct"/>
           </w:tcPr>
           <w:p>
             <w:pPr>
@@ -4980,7 +5302,7 @@
         </w:tc>
         <w:tc>
           <w:tcPr>
-            <w:tcW w:w="328" w:type="pct"/>
+            <w:tcW w:w="329" w:type="pct"/>
           </w:tcPr>
           <w:p>
             <w:pPr>
@@ -5137,7 +5459,7 @@
         </w:tc>
         <w:tc>
           <w:tcPr>
-            <w:tcW w:w="328" w:type="pct"/>
+            <w:tcW w:w="329" w:type="pct"/>
           </w:tcPr>
           <w:p>
             <w:pPr>
@@ -5339,15 +5661,7 @@
           <w:sz w:val="22"/>
           <w:szCs w:val="22"/>
         </w:rPr>
-        <w:t xml:space="preserve"> for the entire system, which exceed the task </w:t>
-      </w:r>
-      <w:r>
-        <w:rPr>
-          <w:sz w:val="22"/>
-          <w:szCs w:val="22"/>
-        </w:rPr>
-        <w:lastRenderedPageBreak/>
-        <w:t>requirement</w:t>
+        <w:t xml:space="preserve"> for the entire system, which exceed the task requirement</w:t>
       </w:r>
       <w:r>
         <w:rPr>
@@ -5378,15 +5692,16 @@
           <w:sz w:val="22"/>
           <w:szCs w:val="22"/>
         </w:rPr>
-        <w:t xml:space="preserve">there is no latch used in this synchronous design task. The number of flip flops, LUTs are recorded in the table </w:t>
-      </w:r>
-      <w:r>
-        <w:rPr>
-          <w:color w:val="FF0000"/>
-          <w:sz w:val="22"/>
-          <w:szCs w:val="22"/>
-        </w:rPr>
-        <w:t>X</w:t>
+        <w:t xml:space="preserve">there is no latch used in this synchronous design task. The number of flip flops, LUTs are recorded in </w:t>
+      </w:r>
+      <w:r>
+        <w:rPr>
+          <w:i/>
+          <w:iCs/>
+          <w:sz w:val="22"/>
+          <w:szCs w:val="22"/>
+        </w:rPr>
+        <w:t>Table 1</w:t>
       </w:r>
       <w:r>
         <w:rPr>
@@ -5395,6 +5710,15 @@
         </w:rPr>
         <w:t xml:space="preserve"> as well.</w:t>
       </w:r>
+    </w:p>
+    <w:p>
+      <w:pPr>
+        <w:spacing w:line="240" w:lineRule="auto"/>
+        <w:rPr>
+          <w:sz w:val="22"/>
+          <w:szCs w:val="22"/>
+        </w:rPr>
+      </w:pPr>
     </w:p>
     <w:p>
       <w:pPr>

</xml_diff>

<commit_message>
Remove large files from repository
</commit_message>
<xml_diff>
--- a/Report/Submission/Report.docx
+++ b/Report/Submission/Report.docx
@@ -1318,56 +1318,6 @@
     </w:p>
     <w:p>
       <w:pPr>
-        <w:pStyle w:val="ListParagraph"/>
-        <w:ind w:left="1701"/>
-        <w:rPr>
-          <w:sz w:val="22"/>
-          <w:szCs w:val="22"/>
-        </w:rPr>
-      </w:pPr>
-    </w:p>
-    <w:p>
-      <w:pPr>
-        <w:pStyle w:val="ListParagraph"/>
-        <w:ind w:left="1701"/>
-        <w:rPr>
-          <w:sz w:val="22"/>
-          <w:szCs w:val="22"/>
-        </w:rPr>
-      </w:pPr>
-    </w:p>
-    <w:p>
-      <w:pPr>
-        <w:pStyle w:val="ListParagraph"/>
-        <w:ind w:left="1701"/>
-        <w:rPr>
-          <w:sz w:val="22"/>
-          <w:szCs w:val="22"/>
-        </w:rPr>
-      </w:pPr>
-    </w:p>
-    <w:p>
-      <w:pPr>
-        <w:pStyle w:val="ListParagraph"/>
-        <w:ind w:left="1701"/>
-        <w:rPr>
-          <w:sz w:val="22"/>
-          <w:szCs w:val="22"/>
-        </w:rPr>
-      </w:pPr>
-    </w:p>
-    <w:p>
-      <w:pPr>
-        <w:pStyle w:val="ListParagraph"/>
-        <w:ind w:left="1701"/>
-        <w:rPr>
-          <w:sz w:val="22"/>
-          <w:szCs w:val="22"/>
-        </w:rPr>
-      </w:pPr>
-    </w:p>
-    <w:p>
-      <w:pPr>
         <w:spacing w:line="240" w:lineRule="auto"/>
         <w:rPr>
           <w:b/>
@@ -1394,6 +1344,33 @@
           <w:szCs w:val="22"/>
         </w:rPr>
       </w:pPr>
+    </w:p>
+    <w:p>
+      <w:pPr>
+        <w:spacing w:line="240" w:lineRule="auto"/>
+        <w:rPr>
+          <w:sz w:val="22"/>
+          <w:szCs w:val="22"/>
+        </w:rPr>
+      </w:pPr>
+    </w:p>
+    <w:p>
+      <w:pPr>
+        <w:spacing w:line="240" w:lineRule="auto"/>
+        <w:rPr>
+          <w:sz w:val="22"/>
+          <w:szCs w:val="22"/>
+        </w:rPr>
+      </w:pPr>
+    </w:p>
+    <w:p>
+      <w:pPr>
+        <w:spacing w:line="240" w:lineRule="auto"/>
+        <w:rPr>
+          <w:sz w:val="22"/>
+          <w:szCs w:val="22"/>
+        </w:rPr>
+      </w:pPr>
       <w:r>
         <w:rPr>
           <w:sz w:val="22"/>
@@ -1450,14 +1427,12 @@
       <w:r>
         <w:rPr>
           <w:noProof/>
-          <w:sz w:val="22"/>
-          <w:szCs w:val="22"/>
         </w:rPr>
         <w:drawing>
-          <wp:inline distT="0" distB="0" distL="0" distR="0" wp14:anchorId="0C37D8AC" wp14:editId="1CF49225">
-            <wp:extent cx="5731510" cy="3912235"/>
-            <wp:effectExtent l="0" t="0" r="0" b="1270"/>
-            <wp:docPr id="136489788" name="Picture 16" descr="A screenshot of a projector&#10;&#10;Description automatically generated"/>
+          <wp:inline distT="0" distB="0" distL="0" distR="0" wp14:anchorId="756B44DB" wp14:editId="0FA85921">
+            <wp:extent cx="5731510" cy="4049395"/>
+            <wp:effectExtent l="0" t="0" r="0" b="1905"/>
+            <wp:docPr id="286960185" name="Picture 1" descr="A screenshot of a project&#10;&#10;Description automatically generated"/>
             <wp:cNvGraphicFramePr>
               <a:graphicFrameLocks xmlns:a="http://schemas.openxmlformats.org/drawingml/2006/main" noChangeAspect="1"/>
             </wp:cNvGraphicFramePr>
@@ -1465,7 +1440,7 @@
               <a:graphicData uri="http://schemas.openxmlformats.org/drawingml/2006/picture">
                 <pic:pic xmlns:pic="http://schemas.openxmlformats.org/drawingml/2006/picture">
                   <pic:nvPicPr>
-                    <pic:cNvPr id="136489788" name="Picture 16" descr="A screenshot of a projector&#10;&#10;Description automatically generated"/>
+                    <pic:cNvPr id="286960185" name="Picture 1" descr="A screenshot of a project&#10;&#10;Description automatically generated"/>
                     <pic:cNvPicPr/>
                   </pic:nvPicPr>
                   <pic:blipFill>
@@ -1477,7 +1452,7 @@
                   <pic:spPr>
                     <a:xfrm>
                       <a:off x="0" y="0"/>
-                      <a:ext cx="5731510" cy="3912235"/>
+                      <a:ext cx="5731510" cy="4049395"/>
                     </a:xfrm>
                     <a:prstGeom prst="rect">
                       <a:avLst/>
@@ -1519,7 +1494,11 @@
         <w:t>: Gantt Chart</w:t>
       </w:r>
     </w:p>
-    <w:p/>
+    <w:p>
+      <w:pPr>
+        <w:spacing w:line="240" w:lineRule="auto"/>
+      </w:pPr>
+    </w:p>
     <w:p>
       <w:pPr>
         <w:spacing w:line="240" w:lineRule="auto"/>
@@ -2397,11 +2376,10 @@
       </w:r>
       <w:r>
         <w:rPr>
-          <w:color w:val="FF0000"/>
-          <w:sz w:val="22"/>
-          <w:szCs w:val="22"/>
-        </w:rPr>
-        <w:t>0x8</w:t>
+          <w:sz w:val="22"/>
+          <w:szCs w:val="22"/>
+        </w:rPr>
+        <w:t>0X00</w:t>
       </w:r>
       <w:r>
         <w:rPr>
@@ -2763,7 +2741,7 @@
           <w:szCs w:val="22"/>
           <w:lang w:val="en-US"/>
         </w:rPr>
-        <w:t xml:space="preserve">the buffer is updated, and its new centre value is subsequently </w:t>
+        <w:t xml:space="preserve">the buffer </w:t>
       </w:r>
       <w:r>
         <w:rPr>
@@ -2771,6 +2749,38 @@
           <w:szCs w:val="22"/>
           <w:lang w:val="en-US"/>
         </w:rPr>
+        <w:t>was</w:t>
+      </w:r>
+      <w:r>
+        <w:rPr>
+          <w:sz w:val="22"/>
+          <w:szCs w:val="22"/>
+          <w:lang w:val="en-US"/>
+        </w:rPr>
+        <w:t xml:space="preserve"> updated, and its new centre value </w:t>
+      </w:r>
+      <w:r>
+        <w:rPr>
+          <w:sz w:val="22"/>
+          <w:szCs w:val="22"/>
+          <w:lang w:val="en-US"/>
+        </w:rPr>
+        <w:t>was</w:t>
+      </w:r>
+      <w:r>
+        <w:rPr>
+          <w:sz w:val="22"/>
+          <w:szCs w:val="22"/>
+          <w:lang w:val="en-US"/>
+        </w:rPr>
+        <w:t xml:space="preserve"> subsequently </w:t>
+      </w:r>
+      <w:r>
+        <w:rPr>
+          <w:sz w:val="22"/>
+          <w:szCs w:val="22"/>
+          <w:lang w:val="en-US"/>
+        </w:rPr>
         <w:t>employed</w:t>
       </w:r>
       <w:r>
@@ -2851,7 +2861,15 @@
           <w:szCs w:val="22"/>
           <w:lang w:val="en-US"/>
         </w:rPr>
-        <w:t xml:space="preserve">are designed to store the intermediate data used later. </w:t>
+        <w:t>were</w:t>
+      </w:r>
+      <w:r>
+        <w:rPr>
+          <w:sz w:val="22"/>
+          <w:szCs w:val="22"/>
+          <w:lang w:val="en-US"/>
+        </w:rPr>
+        <w:t xml:space="preserve"> designed to store the intermediate data used later. </w:t>
       </w:r>
     </w:p>
     <w:p>
@@ -2888,7 +2906,21 @@
           <w:sz w:val="22"/>
           <w:szCs w:val="22"/>
         </w:rPr>
-        <w:t>issue is encountered</w:t>
+        <w:t xml:space="preserve">issue </w:t>
+      </w:r>
+      <w:r>
+        <w:rPr>
+          <w:sz w:val="22"/>
+          <w:szCs w:val="22"/>
+        </w:rPr>
+        <w:t>was</w:t>
+      </w:r>
+      <w:r>
+        <w:rPr>
+          <w:sz w:val="22"/>
+          <w:szCs w:val="22"/>
+        </w:rPr>
+        <w:t xml:space="preserve"> encountered</w:t>
       </w:r>
       <w:r>
         <w:rPr>
@@ -2923,46 +2955,77 @@
           <w:sz w:val="22"/>
           <w:szCs w:val="22"/>
         </w:rPr>
-        <w:t>schematic and netlist are checked. It is founded that the `max_next` signal is assigned when a condition involving itself is satisfied. To solve it, the register `max` signal</w:t>
-      </w:r>
-      <w:r>
-        <w:rPr>
-          <w:sz w:val="22"/>
-          <w:szCs w:val="22"/>
-        </w:rPr>
-        <w:t xml:space="preserve"> replaces this combinational next value in judgment.</w:t>
-      </w:r>
-      <w:r>
-        <w:rPr>
-          <w:sz w:val="22"/>
-          <w:szCs w:val="22"/>
-        </w:rPr>
-        <w:t xml:space="preserve"> </w:t>
-      </w:r>
-      <w:r>
-        <w:rPr>
-          <w:sz w:val="22"/>
-          <w:szCs w:val="22"/>
-        </w:rPr>
-        <w:t>Moreover, the problem of off-by-one was also identified and addressed by correcting the boundary condition.</w:t>
-      </w:r>
-    </w:p>
-    <w:p>
-      <w:pPr>
-        <w:spacing w:line="240" w:lineRule="auto"/>
-        <w:rPr>
-          <w:sz w:val="22"/>
-          <w:szCs w:val="22"/>
-          <w:lang w:val="en-US"/>
-        </w:rPr>
-      </w:pPr>
-      <w:r>
-        <w:rPr>
-          <w:rFonts w:hint="eastAsia"/>
-          <w:sz w:val="22"/>
-          <w:szCs w:val="22"/>
-        </w:rPr>
-        <w:t>时态</w:t>
+        <w:t xml:space="preserve">schematic and netlist </w:t>
+      </w:r>
+      <w:r>
+        <w:rPr>
+          <w:sz w:val="22"/>
+          <w:szCs w:val="22"/>
+        </w:rPr>
+        <w:t>were</w:t>
+      </w:r>
+      <w:r>
+        <w:rPr>
+          <w:sz w:val="22"/>
+          <w:szCs w:val="22"/>
+        </w:rPr>
+        <w:t xml:space="preserve"> checked. It is founded that the `max_next` signal </w:t>
+      </w:r>
+      <w:r>
+        <w:rPr>
+          <w:sz w:val="22"/>
+          <w:szCs w:val="22"/>
+        </w:rPr>
+        <w:t>was</w:t>
+      </w:r>
+      <w:r>
+        <w:rPr>
+          <w:sz w:val="22"/>
+          <w:szCs w:val="22"/>
+        </w:rPr>
+        <w:t xml:space="preserve"> assigned when a condition involving itself </w:t>
+      </w:r>
+      <w:r>
+        <w:rPr>
+          <w:sz w:val="22"/>
+          <w:szCs w:val="22"/>
+        </w:rPr>
+        <w:t>was</w:t>
+      </w:r>
+      <w:r>
+        <w:rPr>
+          <w:sz w:val="22"/>
+          <w:szCs w:val="22"/>
+        </w:rPr>
+        <w:t xml:space="preserve"> satisfied. To solve it, the register `max` signal</w:t>
+      </w:r>
+      <w:r>
+        <w:rPr>
+          <w:sz w:val="22"/>
+          <w:szCs w:val="22"/>
+        </w:rPr>
+        <w:t xml:space="preserve"> replace</w:t>
+      </w:r>
+      <w:r>
+        <w:rPr>
+          <w:sz w:val="22"/>
+          <w:szCs w:val="22"/>
+        </w:rPr>
+        <w:t>d</w:t>
+      </w:r>
+      <w:r>
+        <w:rPr>
+          <w:sz w:val="22"/>
+          <w:szCs w:val="22"/>
+        </w:rPr>
+        <w:t xml:space="preserve"> this combinational next value in judgment.</w:t>
+      </w:r>
+      <w:r>
+        <w:rPr>
+          <w:sz w:val="22"/>
+          <w:szCs w:val="22"/>
+        </w:rPr>
+        <w:t xml:space="preserve"> Moreover, the problem of off-by-one was also identified and addressed by correcting the boundary condition.</w:t>
       </w:r>
     </w:p>
     <w:p>
@@ -3192,35 +3255,7 @@
           <w:sz w:val="22"/>
           <w:szCs w:val="22"/>
         </w:rPr>
-        <w:t xml:space="preserve">the command processor throughout the `valid` and </w:t>
-      </w:r>
-      <w:r>
-        <w:rPr>
-          <w:sz w:val="22"/>
-          <w:szCs w:val="22"/>
-        </w:rPr>
-        <w:t>do</w:t>
-      </w:r>
-      <w:r>
-        <w:rPr>
-          <w:sz w:val="22"/>
-          <w:szCs w:val="22"/>
-        </w:rPr>
-        <w:t>ne`</w:t>
-      </w:r>
-      <w:r>
-        <w:rPr>
-          <w:sz w:val="22"/>
-          <w:szCs w:val="22"/>
-        </w:rPr>
-        <w:t xml:space="preserve"> </w:t>
-      </w:r>
-      <w:r>
-        <w:rPr>
-          <w:sz w:val="22"/>
-          <w:szCs w:val="22"/>
-        </w:rPr>
-        <w:t xml:space="preserve">signals. The former one is pulled up if the input data is ready to be consumed. Simultaneously, </w:t>
+        <w:t xml:space="preserve">the command processor throughout the `valid` and done` signals. The former one is pulled up if the input data is ready to be consumed. Simultaneously, </w:t>
       </w:r>
       <w:r>
         <w:rPr>
@@ -3343,28 +3378,7 @@
           <w:sz w:val="22"/>
           <w:szCs w:val="22"/>
         </w:rPr>
-        <w:t xml:space="preserve">the incoming characters are buffered </w:t>
-      </w:r>
-      <w:r>
-        <w:rPr>
-          <w:sz w:val="22"/>
-          <w:szCs w:val="22"/>
-        </w:rPr>
-        <w:t xml:space="preserve">instead of echoed immediately, preventing data loss and enhancing the system </w:t>
-      </w:r>
-      <w:r>
-        <w:rPr>
-          <w:sz w:val="22"/>
-          <w:szCs w:val="22"/>
-        </w:rPr>
-        <w:t>robustness</w:t>
-      </w:r>
-      <w:r>
-        <w:rPr>
-          <w:sz w:val="22"/>
-          <w:szCs w:val="22"/>
-        </w:rPr>
-        <w:t>.</w:t>
+        <w:t>the incoming characters are buffered instead of echoed immediately, preventing data loss and enhancing the system robustness.</w:t>
       </w:r>
     </w:p>
     <w:p>
@@ -4062,21 +4076,7 @@
           <w:sz w:val="22"/>
           <w:szCs w:val="22"/>
         </w:rPr>
-        <w:t>F</w:t>
-      </w:r>
-      <w:r>
-        <w:rPr>
-          <w:sz w:val="22"/>
-          <w:szCs w:val="22"/>
-        </w:rPr>
-        <w:t>or ANNN command</w:t>
-      </w:r>
-      <w:r>
-        <w:rPr>
-          <w:sz w:val="22"/>
-          <w:szCs w:val="22"/>
-        </w:rPr>
-        <w:t xml:space="preserve">, the system is going to enter the `run` state, asserting the start output and waiting for the response of data processor. Upon detection of `dataReady`, the 8-bit number on the `byte` signal is printed. Afterwards, whether the </w:t>
+        <w:t xml:space="preserve">For ANNN command, the system is going to enter the `run` state, asserting the start output and waiting for the response of data processor. Upon detection of `dataReady`, the 8-bit number on the `byte` signal is printed. Afterwards, whether the </w:t>
       </w:r>
       <w:r>
         <w:rPr>
@@ -4282,7 +4282,21 @@
           <w:sz w:val="22"/>
           <w:szCs w:val="22"/>
         </w:rPr>
-        <w:t xml:space="preserve">n initial difficulty is the type mismatch between </w:t>
+        <w:t xml:space="preserve">n initial difficulty </w:t>
+      </w:r>
+      <w:r>
+        <w:rPr>
+          <w:sz w:val="22"/>
+          <w:szCs w:val="22"/>
+        </w:rPr>
+        <w:t>was</w:t>
+      </w:r>
+      <w:r>
+        <w:rPr>
+          <w:sz w:val="22"/>
+          <w:szCs w:val="22"/>
+        </w:rPr>
+        <w:t xml:space="preserve"> the type mismatch between </w:t>
       </w:r>
       <w:r>
         <w:rPr>
@@ -4296,14 +4310,42 @@
           <w:sz w:val="22"/>
           <w:szCs w:val="22"/>
         </w:rPr>
-        <w:t>ports and the testbench from university. As a result, a wrapper is utilised to perform the type conversion</w:t>
-      </w:r>
-      <w:r>
-        <w:rPr>
-          <w:sz w:val="22"/>
-          <w:szCs w:val="22"/>
-        </w:rPr>
-        <w:t xml:space="preserve"> and there is no need to modify the entire code</w:t>
+        <w:t xml:space="preserve">ports and the testbench from university. As a result, a wrapper </w:t>
+      </w:r>
+      <w:r>
+        <w:rPr>
+          <w:sz w:val="22"/>
+          <w:szCs w:val="22"/>
+        </w:rPr>
+        <w:t>was</w:t>
+      </w:r>
+      <w:r>
+        <w:rPr>
+          <w:sz w:val="22"/>
+          <w:szCs w:val="22"/>
+        </w:rPr>
+        <w:t xml:space="preserve"> utilised to perform the type conversion</w:t>
+      </w:r>
+      <w:r>
+        <w:rPr>
+          <w:sz w:val="22"/>
+          <w:szCs w:val="22"/>
+        </w:rPr>
+        <w:t xml:space="preserve"> and there </w:t>
+      </w:r>
+      <w:r>
+        <w:rPr>
+          <w:sz w:val="22"/>
+          <w:szCs w:val="22"/>
+        </w:rPr>
+        <w:t>would be</w:t>
+      </w:r>
+      <w:r>
+        <w:rPr>
+          <w:sz w:val="22"/>
+          <w:szCs w:val="22"/>
+        </w:rPr>
+        <w:t xml:space="preserve"> no need to modify the entire code</w:t>
       </w:r>
       <w:r>
         <w:rPr>
@@ -4324,7 +4366,21 @@
           <w:sz w:val="22"/>
           <w:szCs w:val="22"/>
         </w:rPr>
-        <w:t>issue encountered during synthesis is that the Xilinx Vivado message panel reports the existence of combinational loop.</w:t>
+        <w:t xml:space="preserve">issue encountered during synthesis </w:t>
+      </w:r>
+      <w:r>
+        <w:rPr>
+          <w:sz w:val="22"/>
+          <w:szCs w:val="22"/>
+        </w:rPr>
+        <w:t>was</w:t>
+      </w:r>
+      <w:r>
+        <w:rPr>
+          <w:sz w:val="22"/>
+          <w:szCs w:val="22"/>
+        </w:rPr>
+        <w:t xml:space="preserve"> that the Xilinx Vivado message panel reports the existence of combinational loop.</w:t>
       </w:r>
       <w:r>
         <w:rPr>
@@ -4338,14 +4394,42 @@
           <w:sz w:val="22"/>
           <w:szCs w:val="22"/>
         </w:rPr>
-        <w:t xml:space="preserve"> the end, it is </w:t>
-      </w:r>
-      <w:r>
-        <w:rPr>
-          <w:sz w:val="22"/>
-          <w:szCs w:val="22"/>
-        </w:rPr>
-        <w:t xml:space="preserve">eventually traced to </w:t>
+        <w:t xml:space="preserve"> the end, it </w:t>
+      </w:r>
+      <w:r>
+        <w:rPr>
+          <w:sz w:val="22"/>
+          <w:szCs w:val="22"/>
+        </w:rPr>
+        <w:t>was</w:t>
+      </w:r>
+      <w:r>
+        <w:rPr>
+          <w:sz w:val="22"/>
+          <w:szCs w:val="22"/>
+        </w:rPr>
+        <w:t xml:space="preserve"> </w:t>
+      </w:r>
+      <w:r>
+        <w:rPr>
+          <w:sz w:val="22"/>
+          <w:szCs w:val="22"/>
+        </w:rPr>
+        <w:t xml:space="preserve">eventually traced </w:t>
+      </w:r>
+      <w:r>
+        <w:rPr>
+          <w:sz w:val="22"/>
+          <w:szCs w:val="22"/>
+        </w:rPr>
+        <w:t xml:space="preserve">back </w:t>
+      </w:r>
+      <w:r>
+        <w:rPr>
+          <w:sz w:val="22"/>
+          <w:szCs w:val="22"/>
+        </w:rPr>
+        <w:t xml:space="preserve">to </w:t>
       </w:r>
       <w:r>
         <w:rPr>
@@ -4366,7 +4450,35 @@
           <w:sz w:val="22"/>
           <w:szCs w:val="22"/>
         </w:rPr>
-        <w:t xml:space="preserve">module combination loop in the handshake logic. Consequently, a register is added in the handshake path so that the risk of instability is eliminated. </w:t>
+        <w:t xml:space="preserve">module combination loop in the handshake logic. Consequently, a register </w:t>
+      </w:r>
+      <w:r>
+        <w:rPr>
+          <w:sz w:val="22"/>
+          <w:szCs w:val="22"/>
+        </w:rPr>
+        <w:t xml:space="preserve">was </w:t>
+      </w:r>
+      <w:r>
+        <w:rPr>
+          <w:sz w:val="22"/>
+          <w:szCs w:val="22"/>
+        </w:rPr>
+        <w:t xml:space="preserve">added in the handshake path so that the risk of instability </w:t>
+      </w:r>
+      <w:r>
+        <w:rPr>
+          <w:sz w:val="22"/>
+          <w:szCs w:val="22"/>
+        </w:rPr>
+        <w:t>was</w:t>
+      </w:r>
+      <w:r>
+        <w:rPr>
+          <w:sz w:val="22"/>
+          <w:szCs w:val="22"/>
+        </w:rPr>
+        <w:t xml:space="preserve"> eliminated. </w:t>
       </w:r>
     </w:p>
     <w:p>
@@ -4436,21 +4548,7 @@
           <w:sz w:val="22"/>
           <w:szCs w:val="22"/>
         </w:rPr>
-        <w:t xml:space="preserve">it is observed that only the output of L is incorrect, and the wrong pattern is unpredictable. To identify the error, some probe signals are temporarily used, which </w:t>
-      </w:r>
-      <w:r>
-        <w:rPr>
-          <w:sz w:val="22"/>
-          <w:szCs w:val="22"/>
-        </w:rPr>
-        <w:t xml:space="preserve">eventually </w:t>
-      </w:r>
-      <w:r>
-        <w:rPr>
-          <w:sz w:val="22"/>
-          <w:szCs w:val="22"/>
-        </w:rPr>
-        <w:t>reveals that it is caused by an incorrect boundary while slicing the 56-bit result vector.</w:t>
+        <w:t>it is observed that only the output of L is incorrect, and the wrong pattern is unpredictable. To identify the error, some probe signals are temporarily used, which eventually reveals that it is caused by an incorrect boundary while slicing the 56-bit result vector.</w:t>
       </w:r>
     </w:p>
     <w:p>
@@ -4480,28 +4578,7 @@
           <w:sz w:val="22"/>
           <w:szCs w:val="22"/>
         </w:rPr>
-        <w:t>data processor, s</w:t>
-      </w:r>
-      <w:r>
-        <w:rPr>
-          <w:sz w:val="22"/>
-          <w:szCs w:val="22"/>
-        </w:rPr>
-        <w:t xml:space="preserve">erval problems emerged </w:t>
-      </w:r>
-      <w:r>
-        <w:rPr>
-          <w:sz w:val="22"/>
-          <w:szCs w:val="22"/>
-        </w:rPr>
-        <w:t xml:space="preserve">while </w:t>
-      </w:r>
-      <w:r>
-        <w:rPr>
-          <w:sz w:val="22"/>
-          <w:szCs w:val="22"/>
-        </w:rPr>
-        <w:t xml:space="preserve">testing on board. The most significant one was that the printed LSB of the last number is always 0, which differs from the actual one. The reason is that the `byte` signal is prematurely cleared before the ‘seqDone’ is asserted. As a result, the `byte` signal is registered </w:t>
+        <w:t xml:space="preserve">data processor, serval problems emerged while testing on board. The most significant one was that the printed LSB of the last number is always 0, which differs from the actual one. The reason is that the `byte` signal is prematurely cleared before the ‘seqDone’ is asserted. As a result, the `byte` signal is registered </w:t>
       </w:r>
       <w:r>
         <w:rPr>
@@ -5604,23 +5681,7 @@
             <w:sz w:val="22"/>
             <w:szCs w:val="22"/>
           </w:rPr>
-          <m:t>1</m:t>
-        </m:r>
-        <m:r>
-          <w:rPr>
-            <w:rFonts w:ascii="Cambria Math" w:hAnsi="Cambria Math"/>
-            <w:sz w:val="22"/>
-            <w:szCs w:val="22"/>
-          </w:rPr>
-          <m:t>83</m:t>
-        </m:r>
-        <m:r>
-          <w:rPr>
-            <w:rFonts w:ascii="Cambria Math" w:hAnsi="Cambria Math"/>
-            <w:sz w:val="22"/>
-            <w:szCs w:val="22"/>
-          </w:rPr>
-          <m:t>MHz</m:t>
+          <m:t>183MHz</m:t>
         </m:r>
       </m:oMath>
       <w:r>
@@ -5637,23 +5698,7 @@
             <w:sz w:val="22"/>
             <w:szCs w:val="22"/>
           </w:rPr>
-          <m:t>1</m:t>
-        </m:r>
-        <m:r>
-          <w:rPr>
-            <w:rFonts w:ascii="Cambria Math" w:hAnsi="Cambria Math"/>
-            <w:sz w:val="22"/>
-            <w:szCs w:val="22"/>
-          </w:rPr>
-          <m:t>51</m:t>
-        </m:r>
-        <m:r>
-          <w:rPr>
-            <w:rFonts w:ascii="Cambria Math" w:hAnsi="Cambria Math"/>
-            <w:sz w:val="22"/>
-            <w:szCs w:val="22"/>
-          </w:rPr>
-          <m:t>MHz</m:t>
+          <m:t>151MHz</m:t>
         </m:r>
       </m:oMath>
       <w:r>
@@ -7637,6 +7682,7 @@
   <w:style w:type="character" w:default="1" w:styleId="DefaultParagraphFont">
     <w:name w:val="Default Paragraph Font"/>
     <w:uiPriority w:val="1"/>
+    <w:semiHidden/>
     <w:unhideWhenUsed/>
   </w:style>
   <w:style w:type="table" w:default="1" w:styleId="TableNormal">

</xml_diff>